<commit_message>
report template + syl upd
</commit_message>
<xml_diff>
--- a/Syllabus update2.docx
+++ b/Syllabus update2.docx
@@ -67,14 +67,7 @@
       </w:r>
       <w:r>
         <w:rPr/>
-        <w:t xml:space="preserve"> Master'</w:t>
-      </w:r>
-      <w:r>
-        <w:rPr/>
-        <w:t>s/Bachelor`s</w:t>
-      </w:r>
-      <w:r>
-        <w:rPr/>
+        <w:t xml:space="preserve"> Master's/Bachelor`s</w:t>
         <w:br/>
       </w:r>
       <w:r>
@@ -708,7 +701,7 @@
     <w:tbl>
       <w:tblPr>
         <w:tblStyle w:val="Table1"/>
-        <w:tblW w:w="9330" w:type="dxa"/>
+        <w:tblW w:w="9600" w:type="dxa"/>
         <w:jc w:val="center"/>
         <w:tblInd w:w="0" w:type="dxa"/>
         <w:tblLayout w:type="fixed"/>
@@ -721,12 +714,13 @@
         <w:tblLook w:val="0600"/>
       </w:tblPr>
       <w:tblGrid>
-        <w:gridCol w:w="385"/>
-        <w:gridCol w:w="572"/>
-        <w:gridCol w:w="639"/>
-        <w:gridCol w:w="3236"/>
-        <w:gridCol w:w="2014"/>
-        <w:gridCol w:w="2484"/>
+        <w:gridCol w:w="495"/>
+        <w:gridCol w:w="525"/>
+        <w:gridCol w:w="510"/>
+        <w:gridCol w:w="2475"/>
+        <w:gridCol w:w="1665"/>
+        <w:gridCol w:w="3045"/>
+        <w:gridCol w:w="885"/>
       </w:tblGrid>
       <w:tr>
         <w:trPr>
@@ -735,7 +729,7 @@
         </w:trPr>
         <w:tc>
           <w:tcPr>
-            <w:tcW w:w="385" w:type="dxa"/>
+            <w:tcW w:w="495" w:type="dxa"/>
             <w:tcBorders>
               <w:bottom w:val="single" w:sz="8" w:space="0" w:color="111111"/>
             </w:tcBorders>
@@ -745,12 +739,16 @@
               <w:pStyle w:val="normal1"/>
               <w:spacing w:before="0" w:after="0"/>
               <w:jc w:val="center"/>
-              <w:rPr/>
+              <w:rPr>
+                <w:sz w:val="14"/>
+                <w:szCs w:val="14"/>
+              </w:rPr>
             </w:pPr>
             <w:r>
               <w:rPr>
                 <w:b/>
-                <w:sz w:val="17"/>
+                <w:sz w:val="14"/>
+                <w:szCs w:val="14"/>
               </w:rPr>
               <w:t>Week</w:t>
             </w:r>
@@ -758,7 +756,7 @@
         </w:tc>
         <w:tc>
           <w:tcPr>
-            <w:tcW w:w="572" w:type="dxa"/>
+            <w:tcW w:w="525" w:type="dxa"/>
             <w:tcBorders>
               <w:bottom w:val="single" w:sz="8" w:space="0" w:color="111111"/>
             </w:tcBorders>
@@ -768,12 +766,16 @@
               <w:pStyle w:val="normal1"/>
               <w:spacing w:before="0" w:after="0"/>
               <w:jc w:val="center"/>
-              <w:rPr/>
+              <w:rPr>
+                <w:sz w:val="14"/>
+                <w:szCs w:val="14"/>
+              </w:rPr>
             </w:pPr>
             <w:r>
               <w:rPr>
                 <w:b/>
-                <w:sz w:val="17"/>
+                <w:sz w:val="14"/>
+                <w:szCs w:val="14"/>
               </w:rPr>
               <w:t>Lectures</w:t>
             </w:r>
@@ -781,7 +783,7 @@
         </w:tc>
         <w:tc>
           <w:tcPr>
-            <w:tcW w:w="639" w:type="dxa"/>
+            <w:tcW w:w="510" w:type="dxa"/>
             <w:tcBorders>
               <w:bottom w:val="single" w:sz="8" w:space="0" w:color="111111"/>
             </w:tcBorders>
@@ -791,12 +793,16 @@
               <w:pStyle w:val="normal1"/>
               <w:spacing w:before="0" w:after="0"/>
               <w:jc w:val="center"/>
-              <w:rPr/>
+              <w:rPr>
+                <w:sz w:val="14"/>
+                <w:szCs w:val="14"/>
+              </w:rPr>
             </w:pPr>
             <w:r>
               <w:rPr>
                 <w:b/>
-                <w:sz w:val="17"/>
+                <w:sz w:val="14"/>
+                <w:szCs w:val="14"/>
               </w:rPr>
               <w:t>Practicals</w:t>
             </w:r>
@@ -804,7 +810,7 @@
         </w:tc>
         <w:tc>
           <w:tcPr>
-            <w:tcW w:w="3236" w:type="dxa"/>
+            <w:tcW w:w="2475" w:type="dxa"/>
             <w:tcBorders>
               <w:bottom w:val="single" w:sz="8" w:space="0" w:color="111111"/>
             </w:tcBorders>
@@ -814,12 +820,16 @@
               <w:pStyle w:val="normal1"/>
               <w:spacing w:before="0" w:after="0"/>
               <w:jc w:val="center"/>
-              <w:rPr/>
+              <w:rPr>
+                <w:sz w:val="14"/>
+                <w:szCs w:val="14"/>
+              </w:rPr>
             </w:pPr>
             <w:r>
               <w:rPr>
                 <w:b/>
-                <w:sz w:val="17"/>
+                <w:sz w:val="14"/>
+                <w:szCs w:val="14"/>
               </w:rPr>
               <w:t>Lecture topic</w:t>
             </w:r>
@@ -827,7 +837,7 @@
         </w:tc>
         <w:tc>
           <w:tcPr>
-            <w:tcW w:w="2014" w:type="dxa"/>
+            <w:tcW w:w="1665" w:type="dxa"/>
             <w:tcBorders>
               <w:top w:val="single" w:sz="4" w:space="0" w:color="111111"/>
               <w:start w:val="single" w:sz="4" w:space="0" w:color="111111"/>
@@ -846,12 +856,16 @@
               <w:pStyle w:val="normal1"/>
               <w:spacing w:before="0" w:after="0"/>
               <w:jc w:val="center"/>
-              <w:rPr/>
+              <w:rPr>
+                <w:sz w:val="14"/>
+                <w:szCs w:val="14"/>
+              </w:rPr>
             </w:pPr>
             <w:r>
               <w:rPr>
                 <w:b/>
-                <w:sz w:val="17"/>
+                <w:sz w:val="14"/>
+                <w:szCs w:val="14"/>
               </w:rPr>
               <w:t>Practical topic</w:t>
             </w:r>
@@ -859,7 +873,7 @@
         </w:tc>
         <w:tc>
           <w:tcPr>
-            <w:tcW w:w="2484" w:type="dxa"/>
+            <w:tcW w:w="3045" w:type="dxa"/>
             <w:tcBorders/>
           </w:tcPr>
           <w:p>
@@ -867,14 +881,42 @@
               <w:pStyle w:val="normal1"/>
               <w:spacing w:before="0" w:after="0"/>
               <w:jc w:val="center"/>
-              <w:rPr/>
+              <w:rPr>
+                <w:sz w:val="14"/>
+                <w:szCs w:val="14"/>
+              </w:rPr>
             </w:pPr>
             <w:r>
               <w:rPr>
                 <w:b/>
-                <w:sz w:val="17"/>
+                <w:sz w:val="14"/>
+                <w:szCs w:val="14"/>
               </w:rPr>
               <w:t>Data type</w:t>
+            </w:r>
+          </w:p>
+        </w:tc>
+        <w:tc>
+          <w:tcPr>
+            <w:tcW w:w="885" w:type="dxa"/>
+            <w:tcBorders/>
+          </w:tcPr>
+          <w:p>
+            <w:pPr>
+              <w:pStyle w:val="normal1"/>
+              <w:spacing w:before="0" w:after="0"/>
+              <w:jc w:val="center"/>
+              <w:rPr>
+                <w:sz w:val="14"/>
+                <w:szCs w:val="14"/>
+              </w:rPr>
+            </w:pPr>
+            <w:r>
+              <w:rPr>
+                <w:sz w:val="14"/>
+                <w:szCs w:val="14"/>
+              </w:rPr>
+              <w:t>Grading</w:t>
             </w:r>
           </w:p>
         </w:tc>
@@ -885,7 +927,7 @@
         </w:trPr>
         <w:tc>
           <w:tcPr>
-            <w:tcW w:w="385" w:type="dxa"/>
+            <w:tcW w:w="495" w:type="dxa"/>
             <w:tcBorders>
               <w:top w:val="single" w:sz="8" w:space="0" w:color="111111"/>
               <w:bottom w:val="single" w:sz="8" w:space="0" w:color="111111"/>
@@ -896,11 +938,15 @@
               <w:pStyle w:val="normal1"/>
               <w:spacing w:before="0" w:after="0"/>
               <w:jc w:val="center"/>
-              <w:rPr/>
-            </w:pPr>
-            <w:r>
-              <w:rPr>
-                <w:sz w:val="17"/>
+              <w:rPr>
+                <w:sz w:val="14"/>
+                <w:szCs w:val="14"/>
+              </w:rPr>
+            </w:pPr>
+            <w:r>
+              <w:rPr>
+                <w:sz w:val="14"/>
+                <w:szCs w:val="14"/>
               </w:rPr>
               <w:t>1</w:t>
             </w:r>
@@ -908,7 +954,7 @@
         </w:tc>
         <w:tc>
           <w:tcPr>
-            <w:tcW w:w="572" w:type="dxa"/>
+            <w:tcW w:w="525" w:type="dxa"/>
             <w:tcBorders>
               <w:top w:val="single" w:sz="8" w:space="0" w:color="111111"/>
               <w:bottom w:val="single" w:sz="8" w:space="0" w:color="111111"/>
@@ -919,11 +965,15 @@
               <w:pStyle w:val="normal1"/>
               <w:spacing w:before="0" w:after="0"/>
               <w:jc w:val="center"/>
-              <w:rPr/>
-            </w:pPr>
-            <w:r>
-              <w:rPr>
-                <w:sz w:val="17"/>
+              <w:rPr>
+                <w:sz w:val="14"/>
+                <w:szCs w:val="14"/>
+              </w:rPr>
+            </w:pPr>
+            <w:r>
+              <w:rPr>
+                <w:sz w:val="14"/>
+                <w:szCs w:val="14"/>
               </w:rPr>
               <w:t>1</w:t>
             </w:r>
@@ -931,7 +981,7 @@
         </w:tc>
         <w:tc>
           <w:tcPr>
-            <w:tcW w:w="639" w:type="dxa"/>
+            <w:tcW w:w="510" w:type="dxa"/>
             <w:tcBorders>
               <w:top w:val="single" w:sz="8" w:space="0" w:color="111111"/>
               <w:bottom w:val="single" w:sz="8" w:space="0" w:color="111111"/>
@@ -942,11 +992,15 @@
               <w:pStyle w:val="normal1"/>
               <w:spacing w:before="0" w:after="0"/>
               <w:jc w:val="center"/>
-              <w:rPr/>
-            </w:pPr>
-            <w:r>
-              <w:rPr>
-                <w:sz w:val="17"/>
+              <w:rPr>
+                <w:sz w:val="14"/>
+                <w:szCs w:val="14"/>
+              </w:rPr>
+            </w:pPr>
+            <w:r>
+              <w:rPr>
+                <w:sz w:val="14"/>
+                <w:szCs w:val="14"/>
               </w:rPr>
               <w:t>1</w:t>
             </w:r>
@@ -954,7 +1008,7 @@
         </w:tc>
         <w:tc>
           <w:tcPr>
-            <w:tcW w:w="3236" w:type="dxa"/>
+            <w:tcW w:w="2475" w:type="dxa"/>
             <w:tcBorders>
               <w:top w:val="single" w:sz="8" w:space="0" w:color="111111"/>
               <w:bottom w:val="single" w:sz="8" w:space="0" w:color="111111"/>
@@ -964,11 +1018,15 @@
             <w:pPr>
               <w:pStyle w:val="normal1"/>
               <w:spacing w:before="0" w:after="0"/>
-              <w:rPr/>
-            </w:pPr>
-            <w:r>
-              <w:rPr>
-                <w:sz w:val="17"/>
+              <w:rPr>
+                <w:sz w:val="14"/>
+                <w:szCs w:val="14"/>
+              </w:rPr>
+            </w:pPr>
+            <w:r>
+              <w:rPr>
+                <w:sz w:val="14"/>
+                <w:szCs w:val="14"/>
               </w:rPr>
               <w:t>Introduction to ML in biosciences; biological data types and the ML workflow</w:t>
             </w:r>
@@ -976,7 +1034,7 @@
         </w:tc>
         <w:tc>
           <w:tcPr>
-            <w:tcW w:w="2014" w:type="dxa"/>
+            <w:tcW w:w="1665" w:type="dxa"/>
             <w:tcBorders>
               <w:top w:val="single" w:sz="4" w:space="0" w:color="111111"/>
               <w:start w:val="single" w:sz="4" w:space="0" w:color="111111"/>
@@ -995,12 +1053,14 @@
               <w:pStyle w:val="normal1"/>
               <w:spacing w:before="0" w:after="0"/>
               <w:rPr>
-                <w:sz w:val="18"/>
-              </w:rPr>
-            </w:pPr>
-            <w:r>
-              <w:rPr>
-                <w:sz w:val="17"/>
+                <w:sz w:val="14"/>
+                <w:szCs w:val="14"/>
+              </w:rPr>
+            </w:pPr>
+            <w:r>
+              <w:rPr>
+                <w:sz w:val="14"/>
+                <w:szCs w:val="14"/>
               </w:rPr>
               <w:t>Biological data exploration, EDA and preprocessing;</w:t>
             </w:r>
@@ -1010,12 +1070,14 @@
               <w:pStyle w:val="normal1"/>
               <w:spacing w:before="0" w:after="0"/>
               <w:rPr>
-                <w:sz w:val="18"/>
-              </w:rPr>
-            </w:pPr>
-            <w:r>
-              <w:rPr>
-                <w:sz w:val="17"/>
+                <w:sz w:val="14"/>
+                <w:szCs w:val="14"/>
+              </w:rPr>
+            </w:pPr>
+            <w:r>
+              <w:rPr>
+                <w:sz w:val="14"/>
+                <w:szCs w:val="14"/>
               </w:rPr>
               <w:t>Tidy data;</w:t>
             </w:r>
@@ -1025,12 +1087,14 @@
               <w:pStyle w:val="normal1"/>
               <w:spacing w:before="0" w:after="0"/>
               <w:rPr>
-                <w:sz w:val="18"/>
-              </w:rPr>
-            </w:pPr>
-            <w:r>
-              <w:rPr>
-                <w:sz w:val="17"/>
+                <w:sz w:val="14"/>
+                <w:szCs w:val="14"/>
+              </w:rPr>
+            </w:pPr>
+            <w:r>
+              <w:rPr>
+                <w:sz w:val="14"/>
+                <w:szCs w:val="14"/>
               </w:rPr>
               <w:t>Constructing an ML-ready X/y dataset</w:t>
             </w:r>
@@ -1038,32 +1102,47 @@
         </w:tc>
         <w:tc>
           <w:tcPr>
-            <w:tcW w:w="2484" w:type="dxa"/>
+            <w:tcW w:w="3045" w:type="dxa"/>
             <w:tcBorders/>
           </w:tcPr>
           <w:p>
             <w:pPr>
               <w:pStyle w:val="normal1"/>
               <w:spacing w:before="0" w:after="0"/>
-              <w:rPr/>
-            </w:pPr>
-            <w:r>
-              <w:rPr>
-                <w:sz w:val="17"/>
-              </w:rPr>
-              <w:t xml:space="preserve">Mixed tabular biological data, </w:t>
-            </w:r>
-            <w:r>
-              <w:rPr>
-                <w:sz w:val="17"/>
-              </w:rPr>
-              <w:t>Mice protein expression</w:t>
-            </w:r>
-            <w:r>
-              <w:rPr>
-                <w:sz w:val="17"/>
-              </w:rPr>
-              <w:t>; use a  messy version with metadata, missing values and categorical variables.</w:t>
+              <w:rPr>
+                <w:sz w:val="14"/>
+                <w:szCs w:val="14"/>
+              </w:rPr>
+            </w:pPr>
+            <w:r>
+              <w:rPr>
+                <w:sz w:val="14"/>
+                <w:szCs w:val="14"/>
+              </w:rPr>
+              <w:t>Mixed tabular biological data, Mice protein expression; use a  messy version with metadata, missing values and categorical variables.</w:t>
+            </w:r>
+          </w:p>
+        </w:tc>
+        <w:tc>
+          <w:tcPr>
+            <w:tcW w:w="885" w:type="dxa"/>
+            <w:tcBorders/>
+          </w:tcPr>
+          <w:p>
+            <w:pPr>
+              <w:pStyle w:val="normal1"/>
+              <w:spacing w:before="0" w:after="0"/>
+              <w:rPr>
+                <w:sz w:val="14"/>
+                <w:szCs w:val="14"/>
+              </w:rPr>
+            </w:pPr>
+            <w:r>
+              <w:rPr>
+                <w:sz w:val="14"/>
+                <w:szCs w:val="14"/>
+              </w:rPr>
+              <w:t>Defense/Report</w:t>
             </w:r>
           </w:p>
         </w:tc>
@@ -1074,7 +1153,7 @@
         </w:trPr>
         <w:tc>
           <w:tcPr>
-            <w:tcW w:w="385" w:type="dxa"/>
+            <w:tcW w:w="495" w:type="dxa"/>
             <w:tcBorders>
               <w:top w:val="single" w:sz="8" w:space="0" w:color="111111"/>
               <w:bottom w:val="single" w:sz="8" w:space="0" w:color="111111"/>
@@ -1085,11 +1164,15 @@
               <w:pStyle w:val="normal1"/>
               <w:spacing w:before="0" w:after="0"/>
               <w:jc w:val="center"/>
-              <w:rPr/>
-            </w:pPr>
-            <w:r>
-              <w:rPr>
-                <w:sz w:val="17"/>
+              <w:rPr>
+                <w:sz w:val="14"/>
+                <w:szCs w:val="14"/>
+              </w:rPr>
+            </w:pPr>
+            <w:r>
+              <w:rPr>
+                <w:sz w:val="14"/>
+                <w:szCs w:val="14"/>
               </w:rPr>
               <w:t>2</w:t>
             </w:r>
@@ -1097,7 +1180,7 @@
         </w:tc>
         <w:tc>
           <w:tcPr>
-            <w:tcW w:w="572" w:type="dxa"/>
+            <w:tcW w:w="525" w:type="dxa"/>
             <w:tcBorders>
               <w:top w:val="single" w:sz="8" w:space="0" w:color="111111"/>
               <w:bottom w:val="single" w:sz="8" w:space="0" w:color="111111"/>
@@ -1108,11 +1191,15 @@
               <w:pStyle w:val="normal1"/>
               <w:spacing w:before="0" w:after="0"/>
               <w:jc w:val="center"/>
-              <w:rPr/>
-            </w:pPr>
-            <w:r>
-              <w:rPr>
-                <w:sz w:val="17"/>
+              <w:rPr>
+                <w:sz w:val="14"/>
+                <w:szCs w:val="14"/>
+              </w:rPr>
+            </w:pPr>
+            <w:r>
+              <w:rPr>
+                <w:sz w:val="14"/>
+                <w:szCs w:val="14"/>
               </w:rPr>
               <w:t>1</w:t>
             </w:r>
@@ -1120,7 +1207,7 @@
         </w:tc>
         <w:tc>
           <w:tcPr>
-            <w:tcW w:w="639" w:type="dxa"/>
+            <w:tcW w:w="510" w:type="dxa"/>
             <w:tcBorders>
               <w:top w:val="single" w:sz="8" w:space="0" w:color="111111"/>
               <w:bottom w:val="single" w:sz="8" w:space="0" w:color="111111"/>
@@ -1131,11 +1218,15 @@
               <w:pStyle w:val="normal1"/>
               <w:spacing w:before="0" w:after="0"/>
               <w:jc w:val="center"/>
-              <w:rPr/>
-            </w:pPr>
-            <w:r>
-              <w:rPr>
-                <w:sz w:val="17"/>
+              <w:rPr>
+                <w:sz w:val="14"/>
+                <w:szCs w:val="14"/>
+              </w:rPr>
+            </w:pPr>
+            <w:r>
+              <w:rPr>
+                <w:sz w:val="14"/>
+                <w:szCs w:val="14"/>
               </w:rPr>
               <w:t>2</w:t>
             </w:r>
@@ -1143,7 +1234,7 @@
         </w:tc>
         <w:tc>
           <w:tcPr>
-            <w:tcW w:w="3236" w:type="dxa"/>
+            <w:tcW w:w="2475" w:type="dxa"/>
             <w:tcBorders>
               <w:top w:val="single" w:sz="8" w:space="0" w:color="111111"/>
               <w:bottom w:val="single" w:sz="8" w:space="0" w:color="111111"/>
@@ -1153,11 +1244,15 @@
             <w:pPr>
               <w:pStyle w:val="normal1"/>
               <w:spacing w:before="0" w:after="0"/>
-              <w:rPr/>
-            </w:pPr>
-            <w:r>
-              <w:rPr>
-                <w:sz w:val="17"/>
+              <w:rPr>
+                <w:sz w:val="14"/>
+                <w:szCs w:val="14"/>
+              </w:rPr>
+            </w:pPr>
+            <w:r>
+              <w:rPr>
+                <w:sz w:val="14"/>
+                <w:szCs w:val="14"/>
               </w:rPr>
               <w:t>Statistics and linear regression in experimental bioscience</w:t>
             </w:r>
@@ -1165,7 +1260,7 @@
         </w:tc>
         <w:tc>
           <w:tcPr>
-            <w:tcW w:w="2014" w:type="dxa"/>
+            <w:tcW w:w="1665" w:type="dxa"/>
             <w:tcBorders>
               <w:top w:val="single" w:sz="4" w:space="0" w:color="111111"/>
               <w:start w:val="single" w:sz="4" w:space="0" w:color="111111"/>
@@ -1184,12 +1279,14 @@
               <w:pStyle w:val="normal1"/>
               <w:spacing w:before="0" w:after="0"/>
               <w:rPr>
-                <w:sz w:val="18"/>
-              </w:rPr>
-            </w:pPr>
-            <w:r>
-              <w:rPr>
-                <w:sz w:val="17"/>
+                <w:sz w:val="14"/>
+                <w:szCs w:val="14"/>
+              </w:rPr>
+            </w:pPr>
+            <w:r>
+              <w:rPr>
+                <w:sz w:val="14"/>
+                <w:szCs w:val="14"/>
               </w:rPr>
               <w:t>preprocessing of quantitative biological/experimental data;</w:t>
             </w:r>
@@ -1199,12 +1296,14 @@
               <w:pStyle w:val="normal1"/>
               <w:spacing w:before="0" w:after="0"/>
               <w:rPr>
-                <w:sz w:val="18"/>
-              </w:rPr>
-            </w:pPr>
-            <w:r>
-              <w:rPr>
-                <w:sz w:val="17"/>
+                <w:sz w:val="14"/>
+                <w:szCs w:val="14"/>
+              </w:rPr>
+            </w:pPr>
+            <w:r>
+              <w:rPr>
+                <w:sz w:val="14"/>
+                <w:szCs w:val="14"/>
               </w:rPr>
               <w:t>Scaling, Normalization, Imputation, Outliers</w:t>
             </w:r>
@@ -1214,26 +1313,30 @@
               <w:pStyle w:val="normal1"/>
               <w:spacing w:before="0" w:after="0"/>
               <w:rPr>
-                <w:sz w:val="18"/>
-              </w:rPr>
-            </w:pPr>
-            <w:r>
-              <w:rPr>
-                <w:sz w:val="18"/>
-              </w:rPr>
-            </w:r>
-          </w:p>
-          <w:p>
-            <w:pPr>
-              <w:pStyle w:val="normal1"/>
-              <w:spacing w:before="0" w:after="0"/>
-              <w:rPr>
-                <w:sz w:val="18"/>
-              </w:rPr>
-            </w:pPr>
-            <w:r>
-              <w:rPr>
-                <w:sz w:val="17"/>
+                <w:sz w:val="14"/>
+                <w:szCs w:val="14"/>
+              </w:rPr>
+            </w:pPr>
+            <w:r>
+              <w:rPr>
+                <w:sz w:val="14"/>
+                <w:szCs w:val="14"/>
+              </w:rPr>
+            </w:r>
+          </w:p>
+          <w:p>
+            <w:pPr>
+              <w:pStyle w:val="normal1"/>
+              <w:spacing w:before="0" w:after="0"/>
+              <w:rPr>
+                <w:sz w:val="14"/>
+                <w:szCs w:val="14"/>
+              </w:rPr>
+            </w:pPr>
+            <w:r>
+              <w:rPr>
+                <w:sz w:val="14"/>
+                <w:szCs w:val="14"/>
               </w:rPr>
               <w:t>Regression diagnostics, regularization, selection</w:t>
             </w:r>
@@ -1241,7 +1344,7 @@
         </w:tc>
         <w:tc>
           <w:tcPr>
-            <w:tcW w:w="2484" w:type="dxa"/>
+            <w:tcW w:w="3045" w:type="dxa"/>
             <w:tcBorders/>
           </w:tcPr>
           <w:p>
@@ -1249,12 +1352,14 @@
               <w:pStyle w:val="normal1"/>
               <w:spacing w:before="0" w:after="0"/>
               <w:rPr>
-                <w:sz w:val="17"/>
-              </w:rPr>
-            </w:pPr>
-            <w:r>
-              <w:rPr>
-                <w:sz w:val="17"/>
+                <w:sz w:val="14"/>
+                <w:szCs w:val="14"/>
+              </w:rPr>
+            </w:pPr>
+            <w:r>
+              <w:rPr>
+                <w:sz w:val="14"/>
+                <w:szCs w:val="14"/>
               </w:rPr>
               <w:t xml:space="preserve">Quantitative biomedical tabular data  scikit-learn Diabetes dataset; </w:t>
             </w:r>
@@ -1264,14 +1369,39 @@
               <w:pStyle w:val="normal1"/>
               <w:spacing w:before="0" w:after="0"/>
               <w:rPr>
-                <w:sz w:val="17"/>
-              </w:rPr>
-            </w:pPr>
-            <w:r>
-              <w:rPr>
-                <w:sz w:val="17"/>
+                <w:sz w:val="14"/>
+                <w:szCs w:val="14"/>
+              </w:rPr>
+            </w:pPr>
+            <w:r>
+              <w:rPr>
+                <w:sz w:val="14"/>
+                <w:szCs w:val="14"/>
               </w:rPr>
               <w:t>missing values/outliers for preprocessing exercises.</w:t>
+            </w:r>
+          </w:p>
+        </w:tc>
+        <w:tc>
+          <w:tcPr>
+            <w:tcW w:w="885" w:type="dxa"/>
+            <w:tcBorders/>
+          </w:tcPr>
+          <w:p>
+            <w:pPr>
+              <w:pStyle w:val="normal1"/>
+              <w:spacing w:before="0" w:after="0"/>
+              <w:rPr>
+                <w:sz w:val="14"/>
+                <w:szCs w:val="14"/>
+              </w:rPr>
+            </w:pPr>
+            <w:r>
+              <w:rPr>
+                <w:sz w:val="14"/>
+                <w:szCs w:val="14"/>
+              </w:rPr>
+              <w:t>Report</w:t>
             </w:r>
           </w:p>
         </w:tc>
@@ -1282,7 +1412,7 @@
         </w:trPr>
         <w:tc>
           <w:tcPr>
-            <w:tcW w:w="385" w:type="dxa"/>
+            <w:tcW w:w="495" w:type="dxa"/>
             <w:tcBorders>
               <w:top w:val="single" w:sz="8" w:space="0" w:color="111111"/>
               <w:bottom w:val="single" w:sz="8" w:space="0" w:color="111111"/>
@@ -1293,11 +1423,15 @@
               <w:pStyle w:val="normal1"/>
               <w:spacing w:before="0" w:after="0"/>
               <w:jc w:val="center"/>
-              <w:rPr/>
-            </w:pPr>
-            <w:r>
-              <w:rPr>
-                <w:sz w:val="17"/>
+              <w:rPr>
+                <w:sz w:val="14"/>
+                <w:szCs w:val="14"/>
+              </w:rPr>
+            </w:pPr>
+            <w:r>
+              <w:rPr>
+                <w:sz w:val="14"/>
+                <w:szCs w:val="14"/>
               </w:rPr>
               <w:t>3</w:t>
             </w:r>
@@ -1305,7 +1439,7 @@
         </w:tc>
         <w:tc>
           <w:tcPr>
-            <w:tcW w:w="572" w:type="dxa"/>
+            <w:tcW w:w="525" w:type="dxa"/>
             <w:tcBorders>
               <w:top w:val="single" w:sz="8" w:space="0" w:color="111111"/>
               <w:bottom w:val="single" w:sz="8" w:space="0" w:color="111111"/>
@@ -1316,11 +1450,15 @@
               <w:pStyle w:val="normal1"/>
               <w:spacing w:before="0" w:after="0"/>
               <w:jc w:val="center"/>
-              <w:rPr/>
-            </w:pPr>
-            <w:r>
-              <w:rPr>
-                <w:sz w:val="17"/>
+              <w:rPr>
+                <w:sz w:val="14"/>
+                <w:szCs w:val="14"/>
+              </w:rPr>
+            </w:pPr>
+            <w:r>
+              <w:rPr>
+                <w:sz w:val="14"/>
+                <w:szCs w:val="14"/>
               </w:rPr>
               <w:t>2</w:t>
             </w:r>
@@ -1328,7 +1466,7 @@
         </w:tc>
         <w:tc>
           <w:tcPr>
-            <w:tcW w:w="639" w:type="dxa"/>
+            <w:tcW w:w="510" w:type="dxa"/>
             <w:tcBorders>
               <w:top w:val="single" w:sz="8" w:space="0" w:color="111111"/>
               <w:bottom w:val="single" w:sz="8" w:space="0" w:color="111111"/>
@@ -1339,11 +1477,15 @@
               <w:pStyle w:val="normal1"/>
               <w:spacing w:before="0" w:after="0"/>
               <w:jc w:val="center"/>
-              <w:rPr/>
-            </w:pPr>
-            <w:r>
-              <w:rPr>
-                <w:sz w:val="17"/>
+              <w:rPr>
+                <w:sz w:val="14"/>
+                <w:szCs w:val="14"/>
+              </w:rPr>
+            </w:pPr>
+            <w:r>
+              <w:rPr>
+                <w:sz w:val="14"/>
+                <w:szCs w:val="14"/>
               </w:rPr>
               <w:t>1</w:t>
             </w:r>
@@ -1351,7 +1493,7 @@
         </w:tc>
         <w:tc>
           <w:tcPr>
-            <w:tcW w:w="3236" w:type="dxa"/>
+            <w:tcW w:w="2475" w:type="dxa"/>
             <w:tcBorders>
               <w:top w:val="single" w:sz="8" w:space="0" w:color="111111"/>
               <w:bottom w:val="single" w:sz="8" w:space="0" w:color="111111"/>
@@ -1361,11 +1503,15 @@
             <w:pPr>
               <w:pStyle w:val="normal1"/>
               <w:spacing w:before="0" w:after="0"/>
-              <w:rPr/>
-            </w:pPr>
-            <w:r>
-              <w:rPr>
-                <w:sz w:val="17"/>
+              <w:rPr>
+                <w:sz w:val="14"/>
+                <w:szCs w:val="14"/>
+              </w:rPr>
+            </w:pPr>
+            <w:r>
+              <w:rPr>
+                <w:sz w:val="14"/>
+                <w:szCs w:val="14"/>
               </w:rPr>
               <w:t>Classification and logistic regression; Class balance; Symbolic and polynomial models</w:t>
             </w:r>
@@ -1373,7 +1519,7 @@
         </w:tc>
         <w:tc>
           <w:tcPr>
-            <w:tcW w:w="2014" w:type="dxa"/>
+            <w:tcW w:w="1665" w:type="dxa"/>
             <w:tcBorders>
               <w:top w:val="single" w:sz="4" w:space="0" w:color="111111"/>
               <w:start w:val="single" w:sz="4" w:space="0" w:color="111111"/>
@@ -1391,11 +1537,15 @@
             <w:pPr>
               <w:pStyle w:val="normal1"/>
               <w:spacing w:before="0" w:after="0"/>
-              <w:rPr/>
-            </w:pPr>
-            <w:r>
-              <w:rPr>
-                <w:sz w:val="17"/>
+              <w:rPr>
+                <w:sz w:val="14"/>
+                <w:szCs w:val="14"/>
+              </w:rPr>
+            </w:pPr>
+            <w:r>
+              <w:rPr>
+                <w:sz w:val="14"/>
+                <w:szCs w:val="14"/>
               </w:rPr>
               <w:t>Logistic regression, train/test splitting and classification metrics on biomedical data, class balancing methods</w:t>
             </w:r>
@@ -1403,20 +1553,47 @@
         </w:tc>
         <w:tc>
           <w:tcPr>
-            <w:tcW w:w="2484" w:type="dxa"/>
+            <w:tcW w:w="3045" w:type="dxa"/>
             <w:tcBorders/>
           </w:tcPr>
           <w:p>
             <w:pPr>
               <w:pStyle w:val="normal1"/>
               <w:spacing w:before="0" w:after="0"/>
-              <w:rPr/>
-            </w:pPr>
-            <w:r>
-              <w:rPr>
-                <w:sz w:val="17"/>
+              <w:rPr>
+                <w:sz w:val="14"/>
+                <w:szCs w:val="14"/>
+              </w:rPr>
+            </w:pPr>
+            <w:r>
+              <w:rPr>
+                <w:sz w:val="14"/>
+                <w:szCs w:val="14"/>
               </w:rPr>
               <w:t>Biomedical classification Wisconsin Diagnostic Breast Cancer dataset.</w:t>
+            </w:r>
+          </w:p>
+        </w:tc>
+        <w:tc>
+          <w:tcPr>
+            <w:tcW w:w="885" w:type="dxa"/>
+            <w:tcBorders/>
+          </w:tcPr>
+          <w:p>
+            <w:pPr>
+              <w:pStyle w:val="normal1"/>
+              <w:spacing w:before="0" w:after="0"/>
+              <w:rPr>
+                <w:sz w:val="14"/>
+                <w:szCs w:val="14"/>
+              </w:rPr>
+            </w:pPr>
+            <w:r>
+              <w:rPr>
+                <w:sz w:val="14"/>
+                <w:szCs w:val="14"/>
+              </w:rPr>
+              <w:t>Report</w:t>
             </w:r>
           </w:p>
         </w:tc>
@@ -1427,7 +1604,7 @@
         </w:trPr>
         <w:tc>
           <w:tcPr>
-            <w:tcW w:w="385" w:type="dxa"/>
+            <w:tcW w:w="495" w:type="dxa"/>
             <w:tcBorders>
               <w:top w:val="single" w:sz="8" w:space="0" w:color="111111"/>
               <w:bottom w:val="single" w:sz="8" w:space="0" w:color="111111"/>
@@ -1438,11 +1615,15 @@
               <w:pStyle w:val="normal1"/>
               <w:spacing w:before="0" w:after="0"/>
               <w:jc w:val="center"/>
-              <w:rPr/>
-            </w:pPr>
-            <w:r>
-              <w:rPr>
-                <w:sz w:val="17"/>
+              <w:rPr>
+                <w:sz w:val="14"/>
+                <w:szCs w:val="14"/>
+              </w:rPr>
+            </w:pPr>
+            <w:r>
+              <w:rPr>
+                <w:sz w:val="14"/>
+                <w:szCs w:val="14"/>
               </w:rPr>
               <w:t>4</w:t>
             </w:r>
@@ -1450,7 +1631,7 @@
         </w:tc>
         <w:tc>
           <w:tcPr>
-            <w:tcW w:w="572" w:type="dxa"/>
+            <w:tcW w:w="525" w:type="dxa"/>
             <w:tcBorders>
               <w:top w:val="single" w:sz="8" w:space="0" w:color="111111"/>
               <w:bottom w:val="single" w:sz="8" w:space="0" w:color="111111"/>
@@ -1461,11 +1642,15 @@
               <w:pStyle w:val="normal1"/>
               <w:spacing w:before="0" w:after="0"/>
               <w:jc w:val="center"/>
-              <w:rPr/>
-            </w:pPr>
-            <w:r>
-              <w:rPr>
-                <w:sz w:val="17"/>
+              <w:rPr>
+                <w:sz w:val="14"/>
+                <w:szCs w:val="14"/>
+              </w:rPr>
+            </w:pPr>
+            <w:r>
+              <w:rPr>
+                <w:sz w:val="14"/>
+                <w:szCs w:val="14"/>
               </w:rPr>
               <w:t>1</w:t>
             </w:r>
@@ -1473,7 +1658,7 @@
         </w:tc>
         <w:tc>
           <w:tcPr>
-            <w:tcW w:w="639" w:type="dxa"/>
+            <w:tcW w:w="510" w:type="dxa"/>
             <w:tcBorders>
               <w:top w:val="single" w:sz="8" w:space="0" w:color="111111"/>
               <w:bottom w:val="single" w:sz="8" w:space="0" w:color="111111"/>
@@ -1484,11 +1669,15 @@
               <w:pStyle w:val="normal1"/>
               <w:spacing w:before="0" w:after="0"/>
               <w:jc w:val="center"/>
-              <w:rPr/>
-            </w:pPr>
-            <w:r>
-              <w:rPr>
-                <w:sz w:val="17"/>
+              <w:rPr>
+                <w:sz w:val="14"/>
+                <w:szCs w:val="14"/>
+              </w:rPr>
+            </w:pPr>
+            <w:r>
+              <w:rPr>
+                <w:sz w:val="14"/>
+                <w:szCs w:val="14"/>
               </w:rPr>
               <w:t>2</w:t>
             </w:r>
@@ -1496,7 +1685,7 @@
         </w:tc>
         <w:tc>
           <w:tcPr>
-            <w:tcW w:w="3236" w:type="dxa"/>
+            <w:tcW w:w="2475" w:type="dxa"/>
             <w:tcBorders>
               <w:top w:val="single" w:sz="8" w:space="0" w:color="111111"/>
               <w:bottom w:val="single" w:sz="8" w:space="0" w:color="111111"/>
@@ -1506,11 +1695,15 @@
             <w:pPr>
               <w:pStyle w:val="normal1"/>
               <w:spacing w:before="0" w:after="0"/>
-              <w:rPr/>
-            </w:pPr>
-            <w:r>
-              <w:rPr>
-                <w:sz w:val="17"/>
+              <w:rPr>
+                <w:sz w:val="14"/>
+                <w:szCs w:val="14"/>
+              </w:rPr>
+            </w:pPr>
+            <w:r>
+              <w:rPr>
+                <w:sz w:val="14"/>
+                <w:szCs w:val="14"/>
               </w:rPr>
               <w:t>High-dimensional biological data; PCA, feature selection and data leakage, other dimensionality reduction algorithms</w:t>
             </w:r>
@@ -1518,7 +1711,7 @@
         </w:tc>
         <w:tc>
           <w:tcPr>
-            <w:tcW w:w="2014" w:type="dxa"/>
+            <w:tcW w:w="1665" w:type="dxa"/>
             <w:tcBorders>
               <w:top w:val="single" w:sz="4" w:space="0" w:color="111111"/>
               <w:start w:val="single" w:sz="4" w:space="0" w:color="111111"/>
@@ -1537,12 +1730,14 @@
               <w:pStyle w:val="normal1"/>
               <w:spacing w:before="0" w:after="0"/>
               <w:rPr>
-                <w:sz w:val="18"/>
-              </w:rPr>
-            </w:pPr>
-            <w:r>
-              <w:rPr>
-                <w:sz w:val="17"/>
+                <w:sz w:val="14"/>
+                <w:szCs w:val="14"/>
+              </w:rPr>
+            </w:pPr>
+            <w:r>
+              <w:rPr>
+                <w:sz w:val="14"/>
+                <w:szCs w:val="14"/>
               </w:rPr>
               <w:t>PCA and feature selection on omics-style data; identifying leakage and batch effects</w:t>
             </w:r>
@@ -1552,26 +1747,30 @@
               <w:pStyle w:val="normal1"/>
               <w:spacing w:before="0" w:after="0"/>
               <w:rPr>
-                <w:sz w:val="18"/>
-              </w:rPr>
-            </w:pPr>
-            <w:r>
-              <w:rPr>
-                <w:sz w:val="18"/>
-              </w:rPr>
-            </w:r>
-          </w:p>
-          <w:p>
-            <w:pPr>
-              <w:pStyle w:val="normal1"/>
-              <w:spacing w:before="0" w:after="0"/>
-              <w:rPr>
-                <w:sz w:val="18"/>
-              </w:rPr>
-            </w:pPr>
-            <w:r>
-              <w:rPr>
-                <w:sz w:val="17"/>
+                <w:sz w:val="14"/>
+                <w:szCs w:val="14"/>
+              </w:rPr>
+            </w:pPr>
+            <w:r>
+              <w:rPr>
+                <w:sz w:val="14"/>
+                <w:szCs w:val="14"/>
+              </w:rPr>
+            </w:r>
+          </w:p>
+          <w:p>
+            <w:pPr>
+              <w:pStyle w:val="normal1"/>
+              <w:spacing w:before="0" w:after="0"/>
+              <w:rPr>
+                <w:sz w:val="14"/>
+                <w:szCs w:val="14"/>
+              </w:rPr>
+            </w:pPr>
+            <w:r>
+              <w:rPr>
+                <w:sz w:val="14"/>
+                <w:szCs w:val="14"/>
               </w:rPr>
               <w:t>Tsne and UMAP</w:t>
             </w:r>
@@ -1579,20 +1778,47 @@
         </w:tc>
         <w:tc>
           <w:tcPr>
-            <w:tcW w:w="2484" w:type="dxa"/>
+            <w:tcW w:w="3045" w:type="dxa"/>
             <w:tcBorders/>
           </w:tcPr>
           <w:p>
             <w:pPr>
               <w:pStyle w:val="normal1"/>
               <w:spacing w:before="0" w:after="0"/>
-              <w:rPr/>
-            </w:pPr>
-            <w:r>
-              <w:rPr>
-                <w:sz w:val="17"/>
+              <w:rPr>
+                <w:sz w:val="14"/>
+                <w:szCs w:val="14"/>
+              </w:rPr>
+            </w:pPr>
+            <w:r>
+              <w:rPr>
+                <w:sz w:val="14"/>
+                <w:szCs w:val="14"/>
               </w:rPr>
               <w:t>High-dimensional omics preprocessed TCGA-BRCA gene-expression subset (samples × genes) with phenotype/batch metadata.</w:t>
+            </w:r>
+          </w:p>
+        </w:tc>
+        <w:tc>
+          <w:tcPr>
+            <w:tcW w:w="885" w:type="dxa"/>
+            <w:tcBorders/>
+          </w:tcPr>
+          <w:p>
+            <w:pPr>
+              <w:pStyle w:val="normal1"/>
+              <w:spacing w:before="0" w:after="0"/>
+              <w:rPr>
+                <w:sz w:val="14"/>
+                <w:szCs w:val="14"/>
+              </w:rPr>
+            </w:pPr>
+            <w:r>
+              <w:rPr>
+                <w:sz w:val="14"/>
+                <w:szCs w:val="14"/>
+              </w:rPr>
+              <w:t>Defense</w:t>
             </w:r>
           </w:p>
         </w:tc>
@@ -1603,7 +1829,7 @@
         </w:trPr>
         <w:tc>
           <w:tcPr>
-            <w:tcW w:w="385" w:type="dxa"/>
+            <w:tcW w:w="495" w:type="dxa"/>
             <w:tcBorders>
               <w:top w:val="single" w:sz="8" w:space="0" w:color="111111"/>
               <w:bottom w:val="single" w:sz="8" w:space="0" w:color="111111"/>
@@ -1614,11 +1840,15 @@
               <w:pStyle w:val="normal1"/>
               <w:spacing w:before="0" w:after="0"/>
               <w:jc w:val="center"/>
-              <w:rPr/>
-            </w:pPr>
-            <w:r>
-              <w:rPr>
-                <w:sz w:val="17"/>
+              <w:rPr>
+                <w:sz w:val="14"/>
+                <w:szCs w:val="14"/>
+              </w:rPr>
+            </w:pPr>
+            <w:r>
+              <w:rPr>
+                <w:sz w:val="14"/>
+                <w:szCs w:val="14"/>
               </w:rPr>
               <w:t>5</w:t>
             </w:r>
@@ -1626,7 +1856,7 @@
         </w:tc>
         <w:tc>
           <w:tcPr>
-            <w:tcW w:w="572" w:type="dxa"/>
+            <w:tcW w:w="525" w:type="dxa"/>
             <w:tcBorders>
               <w:top w:val="single" w:sz="8" w:space="0" w:color="111111"/>
               <w:bottom w:val="single" w:sz="8" w:space="0" w:color="111111"/>
@@ -1637,11 +1867,15 @@
               <w:pStyle w:val="normal1"/>
               <w:spacing w:before="0" w:after="0"/>
               <w:jc w:val="center"/>
-              <w:rPr/>
-            </w:pPr>
-            <w:r>
-              <w:rPr>
-                <w:sz w:val="17"/>
+              <w:rPr>
+                <w:sz w:val="14"/>
+                <w:szCs w:val="14"/>
+              </w:rPr>
+            </w:pPr>
+            <w:r>
+              <w:rPr>
+                <w:sz w:val="14"/>
+                <w:szCs w:val="14"/>
               </w:rPr>
               <w:t>2</w:t>
             </w:r>
@@ -1649,7 +1883,7 @@
         </w:tc>
         <w:tc>
           <w:tcPr>
-            <w:tcW w:w="639" w:type="dxa"/>
+            <w:tcW w:w="510" w:type="dxa"/>
             <w:tcBorders>
               <w:top w:val="single" w:sz="8" w:space="0" w:color="111111"/>
               <w:bottom w:val="single" w:sz="8" w:space="0" w:color="111111"/>
@@ -1660,11 +1894,15 @@
               <w:pStyle w:val="normal1"/>
               <w:spacing w:before="0" w:after="0"/>
               <w:jc w:val="center"/>
-              <w:rPr/>
-            </w:pPr>
-            <w:r>
-              <w:rPr>
-                <w:sz w:val="17"/>
+              <w:rPr>
+                <w:sz w:val="14"/>
+                <w:szCs w:val="14"/>
+              </w:rPr>
+            </w:pPr>
+            <w:r>
+              <w:rPr>
+                <w:sz w:val="14"/>
+                <w:szCs w:val="14"/>
               </w:rPr>
               <w:t>1</w:t>
             </w:r>
@@ -1672,7 +1910,7 @@
         </w:tc>
         <w:tc>
           <w:tcPr>
-            <w:tcW w:w="3236" w:type="dxa"/>
+            <w:tcW w:w="2475" w:type="dxa"/>
             <w:tcBorders>
               <w:top w:val="single" w:sz="8" w:space="0" w:color="111111"/>
               <w:bottom w:val="single" w:sz="8" w:space="0" w:color="111111"/>
@@ -1682,11 +1920,15 @@
             <w:pPr>
               <w:pStyle w:val="normal1"/>
               <w:spacing w:before="0" w:after="0"/>
-              <w:rPr/>
-            </w:pPr>
-            <w:r>
-              <w:rPr>
-                <w:sz w:val="17"/>
+              <w:rPr>
+                <w:sz w:val="14"/>
+                <w:szCs w:val="14"/>
+              </w:rPr>
+            </w:pPr>
+            <w:r>
+              <w:rPr>
+                <w:sz w:val="14"/>
+                <w:szCs w:val="14"/>
               </w:rPr>
               <w:t>Decision Trees, Random Forests and isolation forest, gradient boosting in bioscience</w:t>
             </w:r>
@@ -1694,7 +1936,7 @@
         </w:tc>
         <w:tc>
           <w:tcPr>
-            <w:tcW w:w="2014" w:type="dxa"/>
+            <w:tcW w:w="1665" w:type="dxa"/>
             <w:tcBorders>
               <w:top w:val="single" w:sz="4" w:space="0" w:color="111111"/>
               <w:start w:val="single" w:sz="4" w:space="0" w:color="111111"/>
@@ -1712,11 +1954,15 @@
             <w:pPr>
               <w:pStyle w:val="normal1"/>
               <w:spacing w:before="0" w:after="0"/>
-              <w:rPr/>
-            </w:pPr>
-            <w:r>
-              <w:rPr>
-                <w:sz w:val="17"/>
+              <w:rPr>
+                <w:sz w:val="14"/>
+                <w:szCs w:val="14"/>
+              </w:rPr>
+            </w:pPr>
+            <w:r>
+              <w:rPr>
+                <w:sz w:val="14"/>
+                <w:szCs w:val="14"/>
               </w:rPr>
               <w:t>Tree-based prediction of biological phenotypes/biomarkers and model interpretation, feature selection</w:t>
             </w:r>
@@ -1724,7 +1970,7 @@
         </w:tc>
         <w:tc>
           <w:tcPr>
-            <w:tcW w:w="2484" w:type="dxa"/>
+            <w:tcW w:w="3045" w:type="dxa"/>
             <w:tcBorders/>
           </w:tcPr>
           <w:p>
@@ -1732,12 +1978,14 @@
               <w:pStyle w:val="normal1"/>
               <w:spacing w:before="0" w:after="0"/>
               <w:rPr>
-                <w:sz w:val="17"/>
-              </w:rPr>
-            </w:pPr>
-            <w:r>
-              <w:rPr>
-                <w:sz w:val="17"/>
+                <w:sz w:val="14"/>
+                <w:szCs w:val="14"/>
+              </w:rPr>
+            </w:pPr>
+            <w:r>
+              <w:rPr>
+                <w:sz w:val="14"/>
+                <w:szCs w:val="14"/>
               </w:rPr>
               <w:t xml:space="preserve">Biomedical tabular classification </w:t>
             </w:r>
@@ -1747,20 +1995,46 @@
               <w:pStyle w:val="normal1"/>
               <w:spacing w:before="0" w:after="0"/>
               <w:rPr>
-                <w:sz w:val="17"/>
-              </w:rPr>
-            </w:pPr>
-            <w:r>
-              <w:rPr>
-                <w:sz w:val="17"/>
+                <w:sz w:val="14"/>
+                <w:szCs w:val="14"/>
+              </w:rPr>
+            </w:pPr>
+            <w:r>
+              <w:rPr>
+                <w:sz w:val="14"/>
+                <w:szCs w:val="14"/>
               </w:rPr>
               <w:t xml:space="preserve"> </w:t>
             </w:r>
             <w:r>
               <w:rPr>
-                <w:sz w:val="17"/>
+                <w:sz w:val="14"/>
+                <w:szCs w:val="14"/>
               </w:rPr>
               <w:t>Wisconsin Breast Cancer (reuse for direct comparison with logistic regression) or TCGA-BRCA derived features.</w:t>
+            </w:r>
+          </w:p>
+        </w:tc>
+        <w:tc>
+          <w:tcPr>
+            <w:tcW w:w="885" w:type="dxa"/>
+            <w:tcBorders/>
+          </w:tcPr>
+          <w:p>
+            <w:pPr>
+              <w:pStyle w:val="normal1"/>
+              <w:spacing w:before="0" w:after="0"/>
+              <w:rPr>
+                <w:sz w:val="14"/>
+                <w:szCs w:val="14"/>
+              </w:rPr>
+            </w:pPr>
+            <w:r>
+              <w:rPr>
+                <w:sz w:val="14"/>
+                <w:szCs w:val="14"/>
+              </w:rPr>
+              <w:t>Report</w:t>
             </w:r>
           </w:p>
         </w:tc>
@@ -1771,7 +2045,7 @@
         </w:trPr>
         <w:tc>
           <w:tcPr>
-            <w:tcW w:w="385" w:type="dxa"/>
+            <w:tcW w:w="495" w:type="dxa"/>
             <w:tcBorders>
               <w:top w:val="single" w:sz="8" w:space="0" w:color="111111"/>
               <w:bottom w:val="single" w:sz="8" w:space="0" w:color="111111"/>
@@ -1782,11 +2056,15 @@
               <w:pStyle w:val="normal1"/>
               <w:spacing w:before="0" w:after="0"/>
               <w:jc w:val="center"/>
-              <w:rPr/>
-            </w:pPr>
-            <w:r>
-              <w:rPr>
-                <w:sz w:val="17"/>
+              <w:rPr>
+                <w:sz w:val="14"/>
+                <w:szCs w:val="14"/>
+              </w:rPr>
+            </w:pPr>
+            <w:r>
+              <w:rPr>
+                <w:sz w:val="14"/>
+                <w:szCs w:val="14"/>
               </w:rPr>
               <w:t>6</w:t>
             </w:r>
@@ -1794,7 +2072,7 @@
         </w:tc>
         <w:tc>
           <w:tcPr>
-            <w:tcW w:w="572" w:type="dxa"/>
+            <w:tcW w:w="525" w:type="dxa"/>
             <w:tcBorders>
               <w:top w:val="single" w:sz="8" w:space="0" w:color="111111"/>
               <w:bottom w:val="single" w:sz="8" w:space="0" w:color="111111"/>
@@ -1805,11 +2083,15 @@
               <w:pStyle w:val="normal1"/>
               <w:spacing w:before="0" w:after="0"/>
               <w:jc w:val="center"/>
-              <w:rPr/>
-            </w:pPr>
-            <w:r>
-              <w:rPr>
-                <w:sz w:val="17"/>
+              <w:rPr>
+                <w:sz w:val="14"/>
+                <w:szCs w:val="14"/>
+              </w:rPr>
+            </w:pPr>
+            <w:r>
+              <w:rPr>
+                <w:sz w:val="14"/>
+                <w:szCs w:val="14"/>
               </w:rPr>
               <w:t>1</w:t>
             </w:r>
@@ -1817,7 +2099,7 @@
         </w:tc>
         <w:tc>
           <w:tcPr>
-            <w:tcW w:w="639" w:type="dxa"/>
+            <w:tcW w:w="510" w:type="dxa"/>
             <w:tcBorders>
               <w:top w:val="single" w:sz="8" w:space="0" w:color="111111"/>
               <w:bottom w:val="single" w:sz="8" w:space="0" w:color="111111"/>
@@ -1828,11 +2110,15 @@
               <w:pStyle w:val="normal1"/>
               <w:spacing w:before="0" w:after="0"/>
               <w:jc w:val="center"/>
-              <w:rPr/>
-            </w:pPr>
-            <w:r>
-              <w:rPr>
-                <w:sz w:val="17"/>
+              <w:rPr>
+                <w:sz w:val="14"/>
+                <w:szCs w:val="14"/>
+              </w:rPr>
+            </w:pPr>
+            <w:r>
+              <w:rPr>
+                <w:sz w:val="14"/>
+                <w:szCs w:val="14"/>
               </w:rPr>
               <w:t>2</w:t>
             </w:r>
@@ -1840,7 +2126,7 @@
         </w:tc>
         <w:tc>
           <w:tcPr>
-            <w:tcW w:w="3236" w:type="dxa"/>
+            <w:tcW w:w="2475" w:type="dxa"/>
             <w:tcBorders>
               <w:top w:val="single" w:sz="8" w:space="0" w:color="111111"/>
               <w:bottom w:val="single" w:sz="8" w:space="0" w:color="111111"/>
@@ -1850,11 +2136,15 @@
             <w:pPr>
               <w:pStyle w:val="normal1"/>
               <w:spacing w:before="0" w:after="0"/>
-              <w:rPr/>
-            </w:pPr>
-            <w:r>
-              <w:rPr>
-                <w:sz w:val="17"/>
+              <w:rPr>
+                <w:sz w:val="14"/>
+                <w:szCs w:val="14"/>
+              </w:rPr>
+            </w:pPr>
+            <w:r>
+              <w:rPr>
+                <w:sz w:val="14"/>
+                <w:szCs w:val="14"/>
               </w:rPr>
               <w:t>Similarity-based learning, kNN, SVM and clustering</w:t>
             </w:r>
@@ -1862,7 +2152,7 @@
         </w:tc>
         <w:tc>
           <w:tcPr>
-            <w:tcW w:w="2014" w:type="dxa"/>
+            <w:tcW w:w="1665" w:type="dxa"/>
             <w:tcBorders>
               <w:top w:val="single" w:sz="4" w:space="0" w:color="111111"/>
               <w:start w:val="single" w:sz="4" w:space="0" w:color="111111"/>
@@ -1881,12 +2171,14 @@
               <w:pStyle w:val="normal1"/>
               <w:spacing w:before="0" w:after="0"/>
               <w:rPr>
-                <w:sz w:val="18"/>
-              </w:rPr>
-            </w:pPr>
-            <w:r>
-              <w:rPr>
-                <w:sz w:val="17"/>
+                <w:sz w:val="14"/>
+                <w:szCs w:val="14"/>
+              </w:rPr>
+            </w:pPr>
+            <w:r>
+              <w:rPr>
+                <w:sz w:val="14"/>
+                <w:szCs w:val="14"/>
               </w:rPr>
               <w:t>Biological sample similarity, SVM classification and subtype discovery with clustering</w:t>
             </w:r>
@@ -1896,24 +2188,30 @@
               <w:pStyle w:val="normal1"/>
               <w:spacing w:before="0" w:after="0"/>
               <w:rPr>
-                <w:sz w:val="18"/>
-              </w:rPr>
-            </w:pPr>
-            <w:r>
-              <w:rPr>
-                <w:sz w:val="18"/>
-              </w:rPr>
-            </w:r>
-          </w:p>
-          <w:p>
-            <w:pPr>
-              <w:pStyle w:val="normal1"/>
-              <w:spacing w:before="0" w:after="0"/>
-              <w:rPr/>
-            </w:pPr>
-            <w:r>
-              <w:rPr>
-                <w:sz w:val="17"/>
+                <w:sz w:val="14"/>
+                <w:szCs w:val="14"/>
+              </w:rPr>
+            </w:pPr>
+            <w:r>
+              <w:rPr>
+                <w:sz w:val="14"/>
+                <w:szCs w:val="14"/>
+              </w:rPr>
+            </w:r>
+          </w:p>
+          <w:p>
+            <w:pPr>
+              <w:pStyle w:val="normal1"/>
+              <w:spacing w:before="0" w:after="0"/>
+              <w:rPr>
+                <w:sz w:val="14"/>
+                <w:szCs w:val="14"/>
+              </w:rPr>
+            </w:pPr>
+            <w:r>
+              <w:rPr>
+                <w:sz w:val="14"/>
+                <w:szCs w:val="14"/>
               </w:rPr>
               <w:t xml:space="preserve">kmeans, hclust, spectral </w:t>
             </w:r>
@@ -1921,20 +2219,47 @@
         </w:tc>
         <w:tc>
           <w:tcPr>
-            <w:tcW w:w="2484" w:type="dxa"/>
+            <w:tcW w:w="3045" w:type="dxa"/>
             <w:tcBorders/>
           </w:tcPr>
           <w:p>
             <w:pPr>
               <w:pStyle w:val="normal1"/>
               <w:spacing w:before="0" w:after="0"/>
-              <w:rPr/>
-            </w:pPr>
-            <w:r>
-              <w:rPr>
-                <w:sz w:val="17"/>
+              <w:rPr>
+                <w:sz w:val="14"/>
+                <w:szCs w:val="14"/>
+              </w:rPr>
+            </w:pPr>
+            <w:r>
+              <w:rPr>
+                <w:sz w:val="14"/>
+                <w:szCs w:val="14"/>
               </w:rPr>
               <w:t>Single-cell transcriptomics annotated PBMC 3k subset; cell-type labels allow both clustering and supervised kNN/SVM tasks.</w:t>
+            </w:r>
+          </w:p>
+        </w:tc>
+        <w:tc>
+          <w:tcPr>
+            <w:tcW w:w="885" w:type="dxa"/>
+            <w:tcBorders/>
+          </w:tcPr>
+          <w:p>
+            <w:pPr>
+              <w:pStyle w:val="normal1"/>
+              <w:spacing w:before="0" w:after="0"/>
+              <w:rPr>
+                <w:sz w:val="14"/>
+                <w:szCs w:val="14"/>
+              </w:rPr>
+            </w:pPr>
+            <w:r>
+              <w:rPr>
+                <w:sz w:val="14"/>
+                <w:szCs w:val="14"/>
+              </w:rPr>
+              <w:t>Defense</w:t>
             </w:r>
           </w:p>
         </w:tc>
@@ -1945,7 +2270,7 @@
         </w:trPr>
         <w:tc>
           <w:tcPr>
-            <w:tcW w:w="385" w:type="dxa"/>
+            <w:tcW w:w="495" w:type="dxa"/>
             <w:tcBorders>
               <w:top w:val="single" w:sz="8" w:space="0" w:color="111111"/>
               <w:bottom w:val="single" w:sz="8" w:space="0" w:color="111111"/>
@@ -1956,11 +2281,15 @@
               <w:pStyle w:val="normal1"/>
               <w:spacing w:before="0" w:after="0"/>
               <w:jc w:val="center"/>
-              <w:rPr/>
-            </w:pPr>
-            <w:r>
-              <w:rPr>
-                <w:sz w:val="17"/>
+              <w:rPr>
+                <w:sz w:val="14"/>
+                <w:szCs w:val="14"/>
+              </w:rPr>
+            </w:pPr>
+            <w:r>
+              <w:rPr>
+                <w:sz w:val="14"/>
+                <w:szCs w:val="14"/>
               </w:rPr>
               <w:t>7</w:t>
             </w:r>
@@ -1968,7 +2297,7 @@
         </w:tc>
         <w:tc>
           <w:tcPr>
-            <w:tcW w:w="572" w:type="dxa"/>
+            <w:tcW w:w="525" w:type="dxa"/>
             <w:tcBorders>
               <w:top w:val="single" w:sz="8" w:space="0" w:color="111111"/>
               <w:bottom w:val="single" w:sz="8" w:space="0" w:color="111111"/>
@@ -1979,11 +2308,15 @@
               <w:pStyle w:val="normal1"/>
               <w:spacing w:before="0" w:after="0"/>
               <w:jc w:val="center"/>
-              <w:rPr/>
-            </w:pPr>
-            <w:r>
-              <w:rPr>
-                <w:sz w:val="17"/>
+              <w:rPr>
+                <w:sz w:val="14"/>
+                <w:szCs w:val="14"/>
+              </w:rPr>
+            </w:pPr>
+            <w:r>
+              <w:rPr>
+                <w:sz w:val="14"/>
+                <w:szCs w:val="14"/>
               </w:rPr>
               <w:t>2</w:t>
             </w:r>
@@ -1991,7 +2324,7 @@
         </w:tc>
         <w:tc>
           <w:tcPr>
-            <w:tcW w:w="639" w:type="dxa"/>
+            <w:tcW w:w="510" w:type="dxa"/>
             <w:tcBorders>
               <w:top w:val="single" w:sz="8" w:space="0" w:color="111111"/>
               <w:bottom w:val="single" w:sz="8" w:space="0" w:color="111111"/>
@@ -2002,11 +2335,15 @@
               <w:pStyle w:val="normal1"/>
               <w:spacing w:before="0" w:after="0"/>
               <w:jc w:val="center"/>
-              <w:rPr/>
-            </w:pPr>
-            <w:r>
-              <w:rPr>
-                <w:sz w:val="17"/>
+              <w:rPr>
+                <w:sz w:val="14"/>
+                <w:szCs w:val="14"/>
+              </w:rPr>
+            </w:pPr>
+            <w:r>
+              <w:rPr>
+                <w:sz w:val="14"/>
+                <w:szCs w:val="14"/>
               </w:rPr>
               <w:t>1</w:t>
             </w:r>
@@ -2014,7 +2351,7 @@
         </w:tc>
         <w:tc>
           <w:tcPr>
-            <w:tcW w:w="3236" w:type="dxa"/>
+            <w:tcW w:w="2475" w:type="dxa"/>
             <w:tcBorders>
               <w:top w:val="single" w:sz="8" w:space="0" w:color="111111"/>
               <w:bottom w:val="single" w:sz="8" w:space="0" w:color="111111"/>
@@ -2024,11 +2361,15 @@
             <w:pPr>
               <w:pStyle w:val="normal1"/>
               <w:spacing w:before="0" w:after="0"/>
-              <w:rPr/>
-            </w:pPr>
-            <w:r>
-              <w:rPr>
-                <w:sz w:val="17"/>
+              <w:rPr>
+                <w:sz w:val="14"/>
+                <w:szCs w:val="14"/>
+              </w:rPr>
+            </w:pPr>
+            <w:r>
+              <w:rPr>
+                <w:sz w:val="14"/>
+                <w:szCs w:val="14"/>
               </w:rPr>
               <w:t>Neural networks and representation learning for biological data</w:t>
             </w:r>
@@ -2036,7 +2377,7 @@
         </w:tc>
         <w:tc>
           <w:tcPr>
-            <w:tcW w:w="2014" w:type="dxa"/>
+            <w:tcW w:w="1665" w:type="dxa"/>
             <w:tcBorders>
               <w:top w:val="single" w:sz="4" w:space="0" w:color="111111"/>
               <w:start w:val="single" w:sz="4" w:space="0" w:color="111111"/>
@@ -2054,11 +2395,15 @@
             <w:pPr>
               <w:pStyle w:val="normal1"/>
               <w:spacing w:before="0" w:after="0"/>
-              <w:rPr/>
-            </w:pPr>
-            <w:r>
-              <w:rPr>
-                <w:sz w:val="17"/>
+              <w:rPr>
+                <w:sz w:val="14"/>
+                <w:szCs w:val="14"/>
+              </w:rPr>
+            </w:pPr>
+            <w:r>
+              <w:rPr>
+                <w:sz w:val="14"/>
+                <w:szCs w:val="14"/>
               </w:rPr>
               <w:t>Training and evaluating a basic neural network on a biological prediction task, MLP, model experiment tracking using MLflow</w:t>
             </w:r>
@@ -2066,20 +2411,47 @@
         </w:tc>
         <w:tc>
           <w:tcPr>
-            <w:tcW w:w="2484" w:type="dxa"/>
+            <w:tcW w:w="3045" w:type="dxa"/>
             <w:tcBorders/>
           </w:tcPr>
           <w:p>
             <w:pPr>
               <w:pStyle w:val="normal1"/>
               <w:spacing w:before="0" w:after="0"/>
-              <w:rPr/>
-            </w:pPr>
-            <w:r>
-              <w:rPr>
-                <w:sz w:val="17"/>
+              <w:rPr>
+                <w:sz w:val="14"/>
+                <w:szCs w:val="14"/>
+              </w:rPr>
+            </w:pPr>
+            <w:r>
+              <w:rPr>
+                <w:sz w:val="14"/>
+                <w:szCs w:val="14"/>
               </w:rPr>
               <w:t>High-dimensional biological prediction  TCGA-BRCA expression subset or another omics classification dataset; reuse supports classical-vs-MLP comparison.</w:t>
+            </w:r>
+          </w:p>
+        </w:tc>
+        <w:tc>
+          <w:tcPr>
+            <w:tcW w:w="885" w:type="dxa"/>
+            <w:tcBorders/>
+          </w:tcPr>
+          <w:p>
+            <w:pPr>
+              <w:pStyle w:val="normal1"/>
+              <w:spacing w:before="0" w:after="0"/>
+              <w:rPr>
+                <w:sz w:val="14"/>
+                <w:szCs w:val="14"/>
+              </w:rPr>
+            </w:pPr>
+            <w:r>
+              <w:rPr>
+                <w:sz w:val="14"/>
+                <w:szCs w:val="14"/>
+              </w:rPr>
+              <w:t>Report</w:t>
             </w:r>
           </w:p>
         </w:tc>
@@ -2090,7 +2462,7 @@
         </w:trPr>
         <w:tc>
           <w:tcPr>
-            <w:tcW w:w="385" w:type="dxa"/>
+            <w:tcW w:w="495" w:type="dxa"/>
             <w:tcBorders>
               <w:bottom w:val="single" w:sz="8" w:space="0" w:color="111111"/>
             </w:tcBorders>
@@ -2100,11 +2472,15 @@
               <w:pStyle w:val="normal1"/>
               <w:spacing w:before="0" w:after="0"/>
               <w:jc w:val="center"/>
-              <w:rPr/>
-            </w:pPr>
-            <w:r>
-              <w:rPr>
-                <w:sz w:val="17"/>
+              <w:rPr>
+                <w:sz w:val="14"/>
+                <w:szCs w:val="14"/>
+              </w:rPr>
+            </w:pPr>
+            <w:r>
+              <w:rPr>
+                <w:sz w:val="14"/>
+                <w:szCs w:val="14"/>
               </w:rPr>
               <w:t>8</w:t>
             </w:r>
@@ -2112,7 +2488,7 @@
         </w:tc>
         <w:tc>
           <w:tcPr>
-            <w:tcW w:w="572" w:type="dxa"/>
+            <w:tcW w:w="525" w:type="dxa"/>
             <w:tcBorders>
               <w:bottom w:val="single" w:sz="8" w:space="0" w:color="111111"/>
             </w:tcBorders>
@@ -2122,11 +2498,15 @@
               <w:pStyle w:val="normal1"/>
               <w:spacing w:before="0" w:after="0"/>
               <w:jc w:val="center"/>
-              <w:rPr/>
-            </w:pPr>
-            <w:r>
-              <w:rPr>
-                <w:sz w:val="17"/>
+              <w:rPr>
+                <w:sz w:val="14"/>
+                <w:szCs w:val="14"/>
+              </w:rPr>
+            </w:pPr>
+            <w:r>
+              <w:rPr>
+                <w:sz w:val="14"/>
+                <w:szCs w:val="14"/>
               </w:rPr>
               <w:t>1</w:t>
             </w:r>
@@ -2134,7 +2514,7 @@
         </w:tc>
         <w:tc>
           <w:tcPr>
-            <w:tcW w:w="639" w:type="dxa"/>
+            <w:tcW w:w="510" w:type="dxa"/>
             <w:tcBorders>
               <w:bottom w:val="single" w:sz="8" w:space="0" w:color="111111"/>
             </w:tcBorders>
@@ -2144,11 +2524,15 @@
               <w:pStyle w:val="normal1"/>
               <w:spacing w:before="0" w:after="0"/>
               <w:jc w:val="center"/>
-              <w:rPr/>
-            </w:pPr>
-            <w:r>
-              <w:rPr>
-                <w:sz w:val="17"/>
+              <w:rPr>
+                <w:sz w:val="14"/>
+                <w:szCs w:val="14"/>
+              </w:rPr>
+            </w:pPr>
+            <w:r>
+              <w:rPr>
+                <w:sz w:val="14"/>
+                <w:szCs w:val="14"/>
               </w:rPr>
               <w:t>2</w:t>
             </w:r>
@@ -2156,7 +2540,7 @@
         </w:tc>
         <w:tc>
           <w:tcPr>
-            <w:tcW w:w="3236" w:type="dxa"/>
+            <w:tcW w:w="2475" w:type="dxa"/>
             <w:tcBorders>
               <w:bottom w:val="single" w:sz="8" w:space="0" w:color="111111"/>
             </w:tcBorders>
@@ -2165,11 +2549,15 @@
             <w:pPr>
               <w:pStyle w:val="normal1"/>
               <w:spacing w:before="0" w:after="0"/>
-              <w:rPr/>
-            </w:pPr>
-            <w:r>
-              <w:rPr>
-                <w:sz w:val="17"/>
+              <w:rPr>
+                <w:sz w:val="14"/>
+                <w:szCs w:val="14"/>
+              </w:rPr>
+            </w:pPr>
+            <w:r>
+              <w:rPr>
+                <w:sz w:val="14"/>
+                <w:szCs w:val="14"/>
               </w:rPr>
               <w:t>Computer vision in biosciences: CNNs, detection and segmentation</w:t>
             </w:r>
@@ -2177,7 +2565,7 @@
         </w:tc>
         <w:tc>
           <w:tcPr>
-            <w:tcW w:w="2014" w:type="dxa"/>
+            <w:tcW w:w="1665" w:type="dxa"/>
             <w:tcBorders>
               <w:start w:val="single" w:sz="4" w:space="0" w:color="111111"/>
               <w:bottom w:val="single" w:sz="4" w:space="0" w:color="111111"/>
@@ -2195,12 +2583,14 @@
               <w:pStyle w:val="normal1"/>
               <w:spacing w:before="0" w:after="0"/>
               <w:rPr>
-                <w:sz w:val="18"/>
-              </w:rPr>
-            </w:pPr>
-            <w:r>
-              <w:rPr>
-                <w:sz w:val="17"/>
+                <w:sz w:val="14"/>
+                <w:szCs w:val="14"/>
+              </w:rPr>
+            </w:pPr>
+            <w:r>
+              <w:rPr>
+                <w:sz w:val="14"/>
+                <w:szCs w:val="14"/>
               </w:rPr>
               <w:t>Bioimage classification/detection using microscopy-style data</w:t>
             </w:r>
@@ -2210,24 +2600,30 @@
               <w:pStyle w:val="normal1"/>
               <w:spacing w:before="0" w:after="0"/>
               <w:rPr>
-                <w:sz w:val="18"/>
-              </w:rPr>
-            </w:pPr>
-            <w:r>
-              <w:rPr>
-                <w:sz w:val="18"/>
-              </w:rPr>
-            </w:r>
-          </w:p>
-          <w:p>
-            <w:pPr>
-              <w:pStyle w:val="normal1"/>
-              <w:spacing w:before="0" w:after="0"/>
-              <w:rPr/>
-            </w:pPr>
-            <w:r>
-              <w:rPr>
-                <w:sz w:val="17"/>
+                <w:sz w:val="14"/>
+                <w:szCs w:val="14"/>
+              </w:rPr>
+            </w:pPr>
+            <w:r>
+              <w:rPr>
+                <w:sz w:val="14"/>
+                <w:szCs w:val="14"/>
+              </w:rPr>
+            </w:r>
+          </w:p>
+          <w:p>
+            <w:pPr>
+              <w:pStyle w:val="normal1"/>
+              <w:spacing w:before="0" w:after="0"/>
+              <w:rPr>
+                <w:sz w:val="14"/>
+                <w:szCs w:val="14"/>
+              </w:rPr>
+            </w:pPr>
+            <w:r>
+              <w:rPr>
+                <w:sz w:val="14"/>
+                <w:szCs w:val="14"/>
               </w:rPr>
               <w:t>data annotation strategies and YOLO style models, active learning</w:t>
             </w:r>
@@ -2235,7 +2631,7 @@
         </w:tc>
         <w:tc>
           <w:tcPr>
-            <w:tcW w:w="2484" w:type="dxa"/>
+            <w:tcW w:w="3045" w:type="dxa"/>
             <w:tcBorders/>
           </w:tcPr>
           <w:p>
@@ -2243,12 +2639,14 @@
               <w:pStyle w:val="normal1"/>
               <w:spacing w:before="0" w:after="0"/>
               <w:rPr>
-                <w:sz w:val="17"/>
-              </w:rPr>
-            </w:pPr>
-            <w:r>
-              <w:rPr>
-                <w:sz w:val="17"/>
+                <w:sz w:val="14"/>
+                <w:szCs w:val="14"/>
+              </w:rPr>
+            </w:pPr>
+            <w:r>
+              <w:rPr>
+                <w:sz w:val="14"/>
+                <w:szCs w:val="14"/>
               </w:rPr>
               <w:t xml:space="preserve">Bioimaging </w:t>
             </w:r>
@@ -2258,14 +2656,39 @@
               <w:pStyle w:val="normal1"/>
               <w:spacing w:before="0" w:after="0"/>
               <w:rPr>
-                <w:sz w:val="17"/>
-              </w:rPr>
-            </w:pPr>
-            <w:r>
-              <w:rPr>
-                <w:sz w:val="17"/>
+                <w:sz w:val="14"/>
+                <w:szCs w:val="14"/>
+              </w:rPr>
+            </w:pPr>
+            <w:r>
+              <w:rPr>
+                <w:sz w:val="14"/>
+                <w:szCs w:val="14"/>
               </w:rPr>
               <w:t>Broad Bioimage Benchmark Collection (BBBC) microscopy subset; small annotated cell/colony image set for detection/YOLO exercises.</w:t>
+            </w:r>
+          </w:p>
+        </w:tc>
+        <w:tc>
+          <w:tcPr>
+            <w:tcW w:w="885" w:type="dxa"/>
+            <w:tcBorders/>
+          </w:tcPr>
+          <w:p>
+            <w:pPr>
+              <w:pStyle w:val="normal1"/>
+              <w:spacing w:before="0" w:after="0"/>
+              <w:rPr>
+                <w:sz w:val="14"/>
+                <w:szCs w:val="14"/>
+              </w:rPr>
+            </w:pPr>
+            <w:r>
+              <w:rPr>
+                <w:sz w:val="14"/>
+                <w:szCs w:val="14"/>
+              </w:rPr>
+              <w:t>Defense</w:t>
             </w:r>
           </w:p>
         </w:tc>
@@ -2276,7 +2699,7 @@
         </w:trPr>
         <w:tc>
           <w:tcPr>
-            <w:tcW w:w="385" w:type="dxa"/>
+            <w:tcW w:w="495" w:type="dxa"/>
             <w:tcBorders>
               <w:bottom w:val="single" w:sz="8" w:space="0" w:color="111111"/>
             </w:tcBorders>
@@ -2286,11 +2709,15 @@
               <w:pStyle w:val="normal1"/>
               <w:spacing w:before="0" w:after="0"/>
               <w:jc w:val="center"/>
-              <w:rPr/>
-            </w:pPr>
-            <w:r>
-              <w:rPr>
-                <w:sz w:val="17"/>
+              <w:rPr>
+                <w:sz w:val="14"/>
+                <w:szCs w:val="14"/>
+              </w:rPr>
+            </w:pPr>
+            <w:r>
+              <w:rPr>
+                <w:sz w:val="14"/>
+                <w:szCs w:val="14"/>
               </w:rPr>
               <w:t>9</w:t>
             </w:r>
@@ -2298,7 +2725,7 @@
         </w:tc>
         <w:tc>
           <w:tcPr>
-            <w:tcW w:w="572" w:type="dxa"/>
+            <w:tcW w:w="525" w:type="dxa"/>
             <w:tcBorders>
               <w:bottom w:val="single" w:sz="8" w:space="0" w:color="111111"/>
             </w:tcBorders>
@@ -2308,11 +2735,15 @@
               <w:pStyle w:val="normal1"/>
               <w:spacing w:before="0" w:after="0"/>
               <w:jc w:val="center"/>
-              <w:rPr/>
-            </w:pPr>
-            <w:r>
-              <w:rPr>
-                <w:sz w:val="17"/>
+              <w:rPr>
+                <w:sz w:val="14"/>
+                <w:szCs w:val="14"/>
+              </w:rPr>
+            </w:pPr>
+            <w:r>
+              <w:rPr>
+                <w:sz w:val="14"/>
+                <w:szCs w:val="14"/>
               </w:rPr>
               <w:t>2</w:t>
             </w:r>
@@ -2320,7 +2751,7 @@
         </w:tc>
         <w:tc>
           <w:tcPr>
-            <w:tcW w:w="639" w:type="dxa"/>
+            <w:tcW w:w="510" w:type="dxa"/>
             <w:tcBorders>
               <w:bottom w:val="single" w:sz="8" w:space="0" w:color="111111"/>
             </w:tcBorders>
@@ -2330,11 +2761,15 @@
               <w:pStyle w:val="normal1"/>
               <w:spacing w:before="0" w:after="0"/>
               <w:jc w:val="center"/>
-              <w:rPr/>
-            </w:pPr>
-            <w:r>
-              <w:rPr>
-                <w:sz w:val="17"/>
+              <w:rPr>
+                <w:sz w:val="14"/>
+                <w:szCs w:val="14"/>
+              </w:rPr>
+            </w:pPr>
+            <w:r>
+              <w:rPr>
+                <w:sz w:val="14"/>
+                <w:szCs w:val="14"/>
               </w:rPr>
               <w:t>1</w:t>
             </w:r>
@@ -2342,7 +2777,7 @@
         </w:tc>
         <w:tc>
           <w:tcPr>
-            <w:tcW w:w="3236" w:type="dxa"/>
+            <w:tcW w:w="2475" w:type="dxa"/>
             <w:tcBorders>
               <w:bottom w:val="single" w:sz="8" w:space="0" w:color="111111"/>
             </w:tcBorders>
@@ -2351,11 +2786,15 @@
             <w:pPr>
               <w:pStyle w:val="normal1"/>
               <w:spacing w:before="0" w:after="0"/>
-              <w:rPr/>
-            </w:pPr>
-            <w:r>
-              <w:rPr>
-                <w:sz w:val="17"/>
+              <w:rPr>
+                <w:sz w:val="14"/>
+                <w:szCs w:val="14"/>
+              </w:rPr>
+            </w:pPr>
+            <w:r>
+              <w:rPr>
+                <w:sz w:val="14"/>
+                <w:szCs w:val="14"/>
               </w:rPr>
               <w:t>Cheminformatics and molecular ML: representations, descriptors, fingerprints and QSAR</w:t>
             </w:r>
@@ -2363,7 +2802,7 @@
         </w:tc>
         <w:tc>
           <w:tcPr>
-            <w:tcW w:w="2014" w:type="dxa"/>
+            <w:tcW w:w="1665" w:type="dxa"/>
             <w:tcBorders>
               <w:start w:val="single" w:sz="4" w:space="0" w:color="111111"/>
               <w:bottom w:val="single" w:sz="4" w:space="0" w:color="111111"/>
@@ -2380,11 +2819,15 @@
             <w:pPr>
               <w:pStyle w:val="normal1"/>
               <w:spacing w:before="0" w:after="0"/>
-              <w:rPr/>
-            </w:pPr>
-            <w:r>
-              <w:rPr>
-                <w:sz w:val="17"/>
+              <w:rPr>
+                <w:sz w:val="14"/>
+                <w:szCs w:val="14"/>
+              </w:rPr>
+            </w:pPr>
+            <w:r>
+              <w:rPr>
+                <w:sz w:val="14"/>
+                <w:szCs w:val="14"/>
               </w:rPr>
               <w:t>SMILES processing with RDKit; molecular descriptors/fingerprints and a classical QSAR workflow</w:t>
             </w:r>
@@ -2392,7 +2835,7 @@
         </w:tc>
         <w:tc>
           <w:tcPr>
-            <w:tcW w:w="2484" w:type="dxa"/>
+            <w:tcW w:w="3045" w:type="dxa"/>
             <w:tcBorders/>
           </w:tcPr>
           <w:p>
@@ -2400,12 +2843,14 @@
               <w:pStyle w:val="normal1"/>
               <w:spacing w:before="0" w:after="0"/>
               <w:rPr>
-                <w:sz w:val="17"/>
-              </w:rPr>
-            </w:pPr>
-            <w:r>
-              <w:rPr>
-                <w:sz w:val="17"/>
+                <w:sz w:val="14"/>
+                <w:szCs w:val="14"/>
+              </w:rPr>
+            </w:pPr>
+            <w:r>
+              <w:rPr>
+                <w:sz w:val="14"/>
+                <w:szCs w:val="14"/>
               </w:rPr>
               <w:t xml:space="preserve">Molecular/tabular </w:t>
             </w:r>
@@ -2415,14 +2860,39 @@
               <w:pStyle w:val="normal1"/>
               <w:spacing w:before="0" w:after="0"/>
               <w:rPr>
-                <w:sz w:val="17"/>
-              </w:rPr>
-            </w:pPr>
-            <w:r>
-              <w:rPr>
-                <w:sz w:val="17"/>
+                <w:sz w:val="14"/>
+                <w:szCs w:val="14"/>
+              </w:rPr>
+            </w:pPr>
+            <w:r>
+              <w:rPr>
+                <w:sz w:val="14"/>
+                <w:szCs w:val="14"/>
               </w:rPr>
               <w:t>Delaney ESOL dataset (SMILES + aqueous solubility) for RDKit descriptors, fingerprints and classical QSAR.</w:t>
+            </w:r>
+          </w:p>
+        </w:tc>
+        <w:tc>
+          <w:tcPr>
+            <w:tcW w:w="885" w:type="dxa"/>
+            <w:tcBorders/>
+          </w:tcPr>
+          <w:p>
+            <w:pPr>
+              <w:pStyle w:val="normal1"/>
+              <w:spacing w:before="0" w:after="0"/>
+              <w:rPr>
+                <w:sz w:val="14"/>
+                <w:szCs w:val="14"/>
+              </w:rPr>
+            </w:pPr>
+            <w:r>
+              <w:rPr>
+                <w:sz w:val="14"/>
+                <w:szCs w:val="14"/>
+              </w:rPr>
+              <w:t>Report</w:t>
             </w:r>
           </w:p>
         </w:tc>
@@ -2433,7 +2903,7 @@
         </w:trPr>
         <w:tc>
           <w:tcPr>
-            <w:tcW w:w="385" w:type="dxa"/>
+            <w:tcW w:w="495" w:type="dxa"/>
             <w:tcBorders>
               <w:top w:val="single" w:sz="8" w:space="0" w:color="111111"/>
               <w:bottom w:val="single" w:sz="8" w:space="0" w:color="111111"/>
@@ -2444,11 +2914,15 @@
               <w:pStyle w:val="normal1"/>
               <w:spacing w:before="0" w:after="0"/>
               <w:jc w:val="center"/>
-              <w:rPr/>
-            </w:pPr>
-            <w:r>
-              <w:rPr>
-                <w:sz w:val="17"/>
+              <w:rPr>
+                <w:sz w:val="14"/>
+                <w:szCs w:val="14"/>
+              </w:rPr>
+            </w:pPr>
+            <w:r>
+              <w:rPr>
+                <w:sz w:val="14"/>
+                <w:szCs w:val="14"/>
               </w:rPr>
               <w:t>10</w:t>
             </w:r>
@@ -2456,7 +2930,7 @@
         </w:tc>
         <w:tc>
           <w:tcPr>
-            <w:tcW w:w="572" w:type="dxa"/>
+            <w:tcW w:w="525" w:type="dxa"/>
             <w:tcBorders>
               <w:top w:val="single" w:sz="8" w:space="0" w:color="111111"/>
               <w:bottom w:val="single" w:sz="8" w:space="0" w:color="111111"/>
@@ -2467,11 +2941,15 @@
               <w:pStyle w:val="normal1"/>
               <w:spacing w:before="0" w:after="0"/>
               <w:jc w:val="center"/>
-              <w:rPr/>
-            </w:pPr>
-            <w:r>
-              <w:rPr>
-                <w:sz w:val="17"/>
+              <w:rPr>
+                <w:sz w:val="14"/>
+                <w:szCs w:val="14"/>
+              </w:rPr>
+            </w:pPr>
+            <w:r>
+              <w:rPr>
+                <w:sz w:val="14"/>
+                <w:szCs w:val="14"/>
               </w:rPr>
               <w:t>1</w:t>
             </w:r>
@@ -2479,7 +2957,7 @@
         </w:tc>
         <w:tc>
           <w:tcPr>
-            <w:tcW w:w="639" w:type="dxa"/>
+            <w:tcW w:w="510" w:type="dxa"/>
             <w:tcBorders>
               <w:top w:val="single" w:sz="8" w:space="0" w:color="111111"/>
               <w:bottom w:val="single" w:sz="8" w:space="0" w:color="111111"/>
@@ -2490,11 +2968,15 @@
               <w:pStyle w:val="normal1"/>
               <w:spacing w:before="0" w:after="0"/>
               <w:jc w:val="center"/>
-              <w:rPr/>
-            </w:pPr>
-            <w:r>
-              <w:rPr>
-                <w:sz w:val="17"/>
+              <w:rPr>
+                <w:sz w:val="14"/>
+                <w:szCs w:val="14"/>
+              </w:rPr>
+            </w:pPr>
+            <w:r>
+              <w:rPr>
+                <w:sz w:val="14"/>
+                <w:szCs w:val="14"/>
               </w:rPr>
               <w:t>1</w:t>
             </w:r>
@@ -2502,7 +2984,7 @@
         </w:tc>
         <w:tc>
           <w:tcPr>
-            <w:tcW w:w="3236" w:type="dxa"/>
+            <w:tcW w:w="2475" w:type="dxa"/>
             <w:tcBorders>
               <w:top w:val="single" w:sz="8" w:space="0" w:color="111111"/>
               <w:bottom w:val="single" w:sz="8" w:space="0" w:color="111111"/>
@@ -2512,11 +2994,15 @@
             <w:pPr>
               <w:pStyle w:val="normal1"/>
               <w:spacing w:before="0" w:after="0"/>
-              <w:rPr/>
-            </w:pPr>
-            <w:r>
-              <w:rPr>
-                <w:sz w:val="17"/>
+              <w:rPr>
+                <w:sz w:val="14"/>
+                <w:szCs w:val="14"/>
+              </w:rPr>
+            </w:pPr>
+            <w:r>
+              <w:rPr>
+                <w:sz w:val="14"/>
+                <w:szCs w:val="14"/>
               </w:rPr>
               <w:t>Biological graphs and Graph Neural Networks; molecules as graphs: RNN and LSTM model</w:t>
             </w:r>
@@ -2524,7 +3010,7 @@
         </w:tc>
         <w:tc>
           <w:tcPr>
-            <w:tcW w:w="2014" w:type="dxa"/>
+            <w:tcW w:w="1665" w:type="dxa"/>
             <w:tcBorders>
               <w:top w:val="single" w:sz="4" w:space="0" w:color="111111"/>
               <w:start w:val="single" w:sz="4" w:space="0" w:color="111111"/>
@@ -2542,11 +3028,15 @@
             <w:pPr>
               <w:pStyle w:val="normal1"/>
               <w:spacing w:before="0" w:after="0"/>
-              <w:rPr/>
-            </w:pPr>
-            <w:r>
-              <w:rPr>
-                <w:sz w:val="17"/>
+              <w:rPr>
+                <w:sz w:val="14"/>
+                <w:szCs w:val="14"/>
+              </w:rPr>
+            </w:pPr>
+            <w:r>
+              <w:rPr>
+                <w:sz w:val="14"/>
+                <w:szCs w:val="14"/>
               </w:rPr>
               <w:t>Constructing molecular graphs and performing property prediction with a GNN</w:t>
             </w:r>
@@ -2554,7 +3044,7 @@
         </w:tc>
         <w:tc>
           <w:tcPr>
-            <w:tcW w:w="2484" w:type="dxa"/>
+            <w:tcW w:w="3045" w:type="dxa"/>
             <w:tcBorders/>
           </w:tcPr>
           <w:p>
@@ -2562,12 +3052,14 @@
               <w:pStyle w:val="normal1"/>
               <w:spacing w:before="0" w:after="0"/>
               <w:rPr>
-                <w:sz w:val="17"/>
-              </w:rPr>
-            </w:pPr>
-            <w:r>
-              <w:rPr>
-                <w:sz w:val="17"/>
+                <w:sz w:val="14"/>
+                <w:szCs w:val="14"/>
+              </w:rPr>
+            </w:pPr>
+            <w:r>
+              <w:rPr>
+                <w:sz w:val="14"/>
+                <w:szCs w:val="14"/>
               </w:rPr>
               <w:t>Molecular graphs</w:t>
             </w:r>
@@ -2577,14 +3069,39 @@
               <w:pStyle w:val="normal1"/>
               <w:spacing w:before="0" w:after="0"/>
               <w:rPr>
-                <w:sz w:val="17"/>
-              </w:rPr>
-            </w:pPr>
-            <w:r>
-              <w:rPr>
-                <w:sz w:val="17"/>
+                <w:sz w:val="14"/>
+                <w:szCs w:val="14"/>
+              </w:rPr>
+            </w:pPr>
+            <w:r>
+              <w:rPr>
+                <w:sz w:val="14"/>
+                <w:szCs w:val="14"/>
               </w:rPr>
               <w:t>Delaney ESOL reused as graphs for GNN regression, enabling direct comparison with descriptor-based QSAR.</w:t>
+            </w:r>
+          </w:p>
+        </w:tc>
+        <w:tc>
+          <w:tcPr>
+            <w:tcW w:w="885" w:type="dxa"/>
+            <w:tcBorders/>
+          </w:tcPr>
+          <w:p>
+            <w:pPr>
+              <w:pStyle w:val="normal1"/>
+              <w:spacing w:before="0" w:after="0"/>
+              <w:rPr>
+                <w:sz w:val="14"/>
+                <w:szCs w:val="14"/>
+              </w:rPr>
+            </w:pPr>
+            <w:r>
+              <w:rPr>
+                <w:sz w:val="14"/>
+                <w:szCs w:val="14"/>
+              </w:rPr>
+              <w:t>Report</w:t>
             </w:r>
           </w:p>
         </w:tc>
@@ -2595,7 +3112,7 @@
         </w:trPr>
         <w:tc>
           <w:tcPr>
-            <w:tcW w:w="385" w:type="dxa"/>
+            <w:tcW w:w="495" w:type="dxa"/>
             <w:tcBorders>
               <w:top w:val="single" w:sz="8" w:space="0" w:color="111111"/>
               <w:bottom w:val="single" w:sz="8" w:space="0" w:color="111111"/>
@@ -2606,11 +3123,15 @@
               <w:pStyle w:val="normal1"/>
               <w:spacing w:before="0" w:after="0"/>
               <w:jc w:val="center"/>
-              <w:rPr/>
-            </w:pPr>
-            <w:r>
-              <w:rPr>
-                <w:sz w:val="17"/>
+              <w:rPr>
+                <w:sz w:val="14"/>
+                <w:szCs w:val="14"/>
+              </w:rPr>
+            </w:pPr>
+            <w:r>
+              <w:rPr>
+                <w:sz w:val="14"/>
+                <w:szCs w:val="14"/>
               </w:rPr>
               <w:t>11</w:t>
             </w:r>
@@ -2618,7 +3139,7 @@
         </w:tc>
         <w:tc>
           <w:tcPr>
-            <w:tcW w:w="572" w:type="dxa"/>
+            <w:tcW w:w="525" w:type="dxa"/>
             <w:tcBorders>
               <w:top w:val="single" w:sz="8" w:space="0" w:color="111111"/>
               <w:bottom w:val="single" w:sz="8" w:space="0" w:color="111111"/>
@@ -2629,11 +3150,15 @@
               <w:pStyle w:val="normal1"/>
               <w:spacing w:before="0" w:after="0"/>
               <w:jc w:val="center"/>
-              <w:rPr/>
-            </w:pPr>
-            <w:r>
-              <w:rPr>
-                <w:sz w:val="17"/>
+              <w:rPr>
+                <w:sz w:val="14"/>
+                <w:szCs w:val="14"/>
+              </w:rPr>
+            </w:pPr>
+            <w:r>
+              <w:rPr>
+                <w:sz w:val="14"/>
+                <w:szCs w:val="14"/>
               </w:rPr>
               <w:t>2</w:t>
             </w:r>
@@ -2641,7 +3166,7 @@
         </w:tc>
         <w:tc>
           <w:tcPr>
-            <w:tcW w:w="639" w:type="dxa"/>
+            <w:tcW w:w="510" w:type="dxa"/>
             <w:tcBorders>
               <w:top w:val="single" w:sz="8" w:space="0" w:color="111111"/>
               <w:bottom w:val="single" w:sz="8" w:space="0" w:color="111111"/>
@@ -2652,11 +3177,15 @@
               <w:pStyle w:val="normal1"/>
               <w:spacing w:before="0" w:after="0"/>
               <w:jc w:val="center"/>
-              <w:rPr/>
-            </w:pPr>
-            <w:r>
-              <w:rPr>
-                <w:sz w:val="17"/>
+              <w:rPr>
+                <w:sz w:val="14"/>
+                <w:szCs w:val="14"/>
+              </w:rPr>
+            </w:pPr>
+            <w:r>
+              <w:rPr>
+                <w:sz w:val="14"/>
+                <w:szCs w:val="14"/>
               </w:rPr>
               <w:t>1</w:t>
             </w:r>
@@ -2664,7 +3193,7 @@
         </w:tc>
         <w:tc>
           <w:tcPr>
-            <w:tcW w:w="3236" w:type="dxa"/>
+            <w:tcW w:w="2475" w:type="dxa"/>
             <w:tcBorders>
               <w:top w:val="single" w:sz="8" w:space="0" w:color="111111"/>
               <w:bottom w:val="single" w:sz="8" w:space="0" w:color="111111"/>
@@ -2674,11 +3203,15 @@
             <w:pPr>
               <w:pStyle w:val="normal1"/>
               <w:spacing w:before="0" w:after="0"/>
-              <w:rPr/>
-            </w:pPr>
-            <w:r>
-              <w:rPr>
-                <w:sz w:val="17"/>
+              <w:rPr>
+                <w:sz w:val="14"/>
+                <w:szCs w:val="14"/>
+              </w:rPr>
+            </w:pPr>
+            <w:r>
+              <w:rPr>
+                <w:sz w:val="14"/>
+                <w:szCs w:val="14"/>
               </w:rPr>
               <w:t>Transformers and biological foundation models for DNA, proteins and molecules</w:t>
             </w:r>
@@ -2686,7 +3219,7 @@
         </w:tc>
         <w:tc>
           <w:tcPr>
-            <w:tcW w:w="2014" w:type="dxa"/>
+            <w:tcW w:w="1665" w:type="dxa"/>
             <w:tcBorders>
               <w:top w:val="single" w:sz="4" w:space="0" w:color="111111"/>
               <w:start w:val="single" w:sz="4" w:space="0" w:color="111111"/>
@@ -2704,11 +3237,15 @@
             <w:pPr>
               <w:pStyle w:val="normal1"/>
               <w:spacing w:before="0" w:after="0"/>
-              <w:rPr/>
-            </w:pPr>
-            <w:r>
-              <w:rPr>
-                <w:sz w:val="17"/>
+              <w:rPr>
+                <w:sz w:val="14"/>
+                <w:szCs w:val="14"/>
+              </w:rPr>
+            </w:pPr>
+            <w:r>
+              <w:rPr>
+                <w:sz w:val="14"/>
+                <w:szCs w:val="14"/>
               </w:rPr>
               <w:t>Using pre-trained biological models: embeddings, transfer learning and basic fine-tuning</w:t>
             </w:r>
@@ -2716,7 +3253,7 @@
         </w:tc>
         <w:tc>
           <w:tcPr>
-            <w:tcW w:w="2484" w:type="dxa"/>
+            <w:tcW w:w="3045" w:type="dxa"/>
             <w:tcBorders/>
           </w:tcPr>
           <w:p>
@@ -2724,12 +3261,14 @@
               <w:pStyle w:val="normal1"/>
               <w:spacing w:before="0" w:after="0"/>
               <w:rPr>
-                <w:sz w:val="17"/>
-              </w:rPr>
-            </w:pPr>
-            <w:r>
-              <w:rPr>
-                <w:sz w:val="17"/>
+                <w:sz w:val="14"/>
+                <w:szCs w:val="14"/>
+              </w:rPr>
+            </w:pPr>
+            <w:r>
+              <w:rPr>
+                <w:sz w:val="14"/>
+                <w:szCs w:val="14"/>
               </w:rPr>
               <w:t xml:space="preserve">Biological sequences </w:t>
             </w:r>
@@ -2739,14 +3278,39 @@
               <w:pStyle w:val="normal1"/>
               <w:spacing w:before="0" w:after="0"/>
               <w:rPr>
-                <w:sz w:val="17"/>
-              </w:rPr>
-            </w:pPr>
-            <w:r>
-              <w:rPr>
-                <w:sz w:val="17"/>
+                <w:sz w:val="14"/>
+                <w:szCs w:val="14"/>
+              </w:rPr>
+            </w:pPr>
+            <w:r>
+              <w:rPr>
+                <w:sz w:val="14"/>
+                <w:szCs w:val="14"/>
               </w:rPr>
               <w:t>UniProt/DeepLoc-style protein sequence set; generate pretrained protein embeddings and perform downstream classification.</w:t>
+            </w:r>
+          </w:p>
+        </w:tc>
+        <w:tc>
+          <w:tcPr>
+            <w:tcW w:w="885" w:type="dxa"/>
+            <w:tcBorders/>
+          </w:tcPr>
+          <w:p>
+            <w:pPr>
+              <w:pStyle w:val="normal1"/>
+              <w:spacing w:before="0" w:after="0"/>
+              <w:rPr>
+                <w:sz w:val="14"/>
+                <w:szCs w:val="14"/>
+              </w:rPr>
+            </w:pPr>
+            <w:r>
+              <w:rPr>
+                <w:sz w:val="14"/>
+                <w:szCs w:val="14"/>
+              </w:rPr>
+              <w:t>Defense</w:t>
             </w:r>
           </w:p>
         </w:tc>
@@ -2757,7 +3321,7 @@
         </w:trPr>
         <w:tc>
           <w:tcPr>
-            <w:tcW w:w="385" w:type="dxa"/>
+            <w:tcW w:w="495" w:type="dxa"/>
             <w:tcBorders>
               <w:top w:val="single" w:sz="8" w:space="0" w:color="111111"/>
               <w:bottom w:val="single" w:sz="8" w:space="0" w:color="111111"/>
@@ -2768,11 +3332,15 @@
               <w:pStyle w:val="normal1"/>
               <w:spacing w:before="0" w:after="0"/>
               <w:jc w:val="center"/>
-              <w:rPr/>
-            </w:pPr>
-            <w:r>
-              <w:rPr>
-                <w:sz w:val="17"/>
+              <w:rPr>
+                <w:sz w:val="14"/>
+                <w:szCs w:val="14"/>
+              </w:rPr>
+            </w:pPr>
+            <w:r>
+              <w:rPr>
+                <w:sz w:val="14"/>
+                <w:szCs w:val="14"/>
               </w:rPr>
               <w:t>12</w:t>
             </w:r>
@@ -2780,7 +3348,7 @@
         </w:tc>
         <w:tc>
           <w:tcPr>
-            <w:tcW w:w="572" w:type="dxa"/>
+            <w:tcW w:w="525" w:type="dxa"/>
             <w:tcBorders>
               <w:top w:val="single" w:sz="8" w:space="0" w:color="111111"/>
               <w:bottom w:val="single" w:sz="8" w:space="0" w:color="111111"/>
@@ -2791,11 +3359,15 @@
               <w:pStyle w:val="normal1"/>
               <w:spacing w:before="0" w:after="0"/>
               <w:jc w:val="center"/>
-              <w:rPr/>
-            </w:pPr>
-            <w:r>
-              <w:rPr>
-                <w:sz w:val="17"/>
+              <w:rPr>
+                <w:sz w:val="14"/>
+                <w:szCs w:val="14"/>
+              </w:rPr>
+            </w:pPr>
+            <w:r>
+              <w:rPr>
+                <w:sz w:val="14"/>
+                <w:szCs w:val="14"/>
               </w:rPr>
               <w:t>1</w:t>
             </w:r>
@@ -2803,7 +3375,7 @@
         </w:tc>
         <w:tc>
           <w:tcPr>
-            <w:tcW w:w="639" w:type="dxa"/>
+            <w:tcW w:w="510" w:type="dxa"/>
             <w:tcBorders>
               <w:top w:val="single" w:sz="8" w:space="0" w:color="111111"/>
               <w:bottom w:val="single" w:sz="8" w:space="0" w:color="111111"/>
@@ -2814,11 +3386,15 @@
               <w:pStyle w:val="normal1"/>
               <w:spacing w:before="0" w:after="0"/>
               <w:jc w:val="center"/>
-              <w:rPr/>
-            </w:pPr>
-            <w:r>
-              <w:rPr>
-                <w:sz w:val="17"/>
+              <w:rPr>
+                <w:sz w:val="14"/>
+                <w:szCs w:val="14"/>
+              </w:rPr>
+            </w:pPr>
+            <w:r>
+              <w:rPr>
+                <w:sz w:val="14"/>
+                <w:szCs w:val="14"/>
               </w:rPr>
               <w:t>1</w:t>
             </w:r>
@@ -2826,7 +3402,7 @@
         </w:tc>
         <w:tc>
           <w:tcPr>
-            <w:tcW w:w="3236" w:type="dxa"/>
+            <w:tcW w:w="2475" w:type="dxa"/>
             <w:tcBorders>
               <w:top w:val="single" w:sz="8" w:space="0" w:color="111111"/>
               <w:bottom w:val="single" w:sz="8" w:space="0" w:color="111111"/>
@@ -2836,11 +3412,15 @@
             <w:pPr>
               <w:pStyle w:val="normal1"/>
               <w:spacing w:before="0" w:after="0"/>
-              <w:rPr/>
-            </w:pPr>
-            <w:r>
-              <w:rPr>
-                <w:sz w:val="17"/>
+              <w:rPr>
+                <w:sz w:val="14"/>
+                <w:szCs w:val="14"/>
+              </w:rPr>
+            </w:pPr>
+            <w:r>
+              <w:rPr>
+                <w:sz w:val="14"/>
+                <w:szCs w:val="14"/>
               </w:rPr>
               <w:t>Machine learning for omics and transcriptomics</w:t>
             </w:r>
@@ -2848,7 +3428,7 @@
         </w:tc>
         <w:tc>
           <w:tcPr>
-            <w:tcW w:w="2014" w:type="dxa"/>
+            <w:tcW w:w="1665" w:type="dxa"/>
             <w:tcBorders>
               <w:top w:val="single" w:sz="4" w:space="0" w:color="111111"/>
               <w:start w:val="single" w:sz="4" w:space="0" w:color="111111"/>
@@ -2866,11 +3446,15 @@
             <w:pPr>
               <w:pStyle w:val="normal1"/>
               <w:spacing w:before="0" w:after="0"/>
-              <w:rPr/>
-            </w:pPr>
-            <w:r>
-              <w:rPr>
-                <w:sz w:val="17"/>
+              <w:rPr>
+                <w:sz w:val="14"/>
+                <w:szCs w:val="14"/>
+              </w:rPr>
+            </w:pPr>
+            <w:r>
+              <w:rPr>
+                <w:sz w:val="14"/>
+                <w:szCs w:val="14"/>
               </w:rPr>
               <w:t>Transcriptomic data preprocessing, dimensionality reduction and predictive modelling</w:t>
             </w:r>
@@ -2878,7 +3462,7 @@
         </w:tc>
         <w:tc>
           <w:tcPr>
-            <w:tcW w:w="2484" w:type="dxa"/>
+            <w:tcW w:w="3045" w:type="dxa"/>
             <w:tcBorders/>
           </w:tcPr>
           <w:p>
@@ -2886,12 +3470,14 @@
               <w:pStyle w:val="normal1"/>
               <w:spacing w:before="0" w:after="0"/>
               <w:rPr>
-                <w:sz w:val="17"/>
-              </w:rPr>
-            </w:pPr>
-            <w:r>
-              <w:rPr>
-                <w:sz w:val="17"/>
+                <w:sz w:val="14"/>
+                <w:szCs w:val="14"/>
+              </w:rPr>
+            </w:pPr>
+            <w:r>
+              <w:rPr>
+                <w:sz w:val="14"/>
+                <w:szCs w:val="14"/>
               </w:rPr>
               <w:t xml:space="preserve">Bulk transcriptomics </w:t>
             </w:r>
@@ -2901,14 +3487,39 @@
               <w:pStyle w:val="normal1"/>
               <w:spacing w:before="0" w:after="0"/>
               <w:rPr>
-                <w:sz w:val="17"/>
-              </w:rPr>
-            </w:pPr>
-            <w:r>
-              <w:rPr>
-                <w:sz w:val="17"/>
+                <w:sz w:val="14"/>
+                <w:szCs w:val="14"/>
+              </w:rPr>
+            </w:pPr>
+            <w:r>
+              <w:rPr>
+                <w:sz w:val="14"/>
+                <w:szCs w:val="14"/>
               </w:rPr>
               <w:t>TCGA-BRCA or a curated GEO expression dataset with sample metadata; preprocessing, PCA and predictive modelling.</w:t>
+            </w:r>
+          </w:p>
+        </w:tc>
+        <w:tc>
+          <w:tcPr>
+            <w:tcW w:w="885" w:type="dxa"/>
+            <w:tcBorders/>
+          </w:tcPr>
+          <w:p>
+            <w:pPr>
+              <w:pStyle w:val="normal1"/>
+              <w:spacing w:before="0" w:after="0"/>
+              <w:rPr>
+                <w:sz w:val="14"/>
+                <w:szCs w:val="14"/>
+              </w:rPr>
+            </w:pPr>
+            <w:r>
+              <w:rPr>
+                <w:sz w:val="14"/>
+                <w:szCs w:val="14"/>
+              </w:rPr>
+              <w:t>Report</w:t>
             </w:r>
           </w:p>
         </w:tc>
@@ -2919,7 +3530,7 @@
         </w:trPr>
         <w:tc>
           <w:tcPr>
-            <w:tcW w:w="385" w:type="dxa"/>
+            <w:tcW w:w="495" w:type="dxa"/>
             <w:tcBorders>
               <w:top w:val="single" w:sz="8" w:space="0" w:color="111111"/>
               <w:bottom w:val="single" w:sz="8" w:space="0" w:color="111111"/>
@@ -2930,11 +3541,15 @@
               <w:pStyle w:val="normal1"/>
               <w:spacing w:before="0" w:after="0"/>
               <w:jc w:val="center"/>
-              <w:rPr/>
-            </w:pPr>
-            <w:r>
-              <w:rPr>
-                <w:sz w:val="17"/>
+              <w:rPr>
+                <w:sz w:val="14"/>
+                <w:szCs w:val="14"/>
+              </w:rPr>
+            </w:pPr>
+            <w:r>
+              <w:rPr>
+                <w:sz w:val="14"/>
+                <w:szCs w:val="14"/>
               </w:rPr>
               <w:t>13</w:t>
             </w:r>
@@ -2942,7 +3557,7 @@
         </w:tc>
         <w:tc>
           <w:tcPr>
-            <w:tcW w:w="572" w:type="dxa"/>
+            <w:tcW w:w="525" w:type="dxa"/>
             <w:tcBorders>
               <w:top w:val="single" w:sz="8" w:space="0" w:color="111111"/>
               <w:bottom w:val="single" w:sz="8" w:space="0" w:color="111111"/>
@@ -2953,11 +3568,15 @@
               <w:pStyle w:val="normal1"/>
               <w:spacing w:before="0" w:after="0"/>
               <w:jc w:val="center"/>
-              <w:rPr/>
-            </w:pPr>
-            <w:r>
-              <w:rPr>
-                <w:sz w:val="17"/>
+              <w:rPr>
+                <w:sz w:val="14"/>
+                <w:szCs w:val="14"/>
+              </w:rPr>
+            </w:pPr>
+            <w:r>
+              <w:rPr>
+                <w:sz w:val="14"/>
+                <w:szCs w:val="14"/>
               </w:rPr>
               <w:t>1</w:t>
             </w:r>
@@ -2965,7 +3584,7 @@
         </w:tc>
         <w:tc>
           <w:tcPr>
-            <w:tcW w:w="639" w:type="dxa"/>
+            <w:tcW w:w="510" w:type="dxa"/>
             <w:tcBorders>
               <w:top w:val="single" w:sz="8" w:space="0" w:color="111111"/>
               <w:bottom w:val="single" w:sz="8" w:space="0" w:color="111111"/>
@@ -2976,11 +3595,15 @@
               <w:pStyle w:val="normal1"/>
               <w:spacing w:before="0" w:after="0"/>
               <w:jc w:val="center"/>
-              <w:rPr/>
-            </w:pPr>
-            <w:r>
-              <w:rPr>
-                <w:sz w:val="17"/>
+              <w:rPr>
+                <w:sz w:val="14"/>
+                <w:szCs w:val="14"/>
+              </w:rPr>
+            </w:pPr>
+            <w:r>
+              <w:rPr>
+                <w:sz w:val="14"/>
+                <w:szCs w:val="14"/>
               </w:rPr>
               <w:t>1</w:t>
             </w:r>
@@ -2988,7 +3611,7 @@
         </w:tc>
         <w:tc>
           <w:tcPr>
-            <w:tcW w:w="3236" w:type="dxa"/>
+            <w:tcW w:w="2475" w:type="dxa"/>
             <w:tcBorders>
               <w:top w:val="single" w:sz="8" w:space="0" w:color="111111"/>
               <w:bottom w:val="single" w:sz="8" w:space="0" w:color="111111"/>
@@ -2998,11 +3621,15 @@
             <w:pPr>
               <w:pStyle w:val="normal1"/>
               <w:spacing w:before="0" w:after="0"/>
-              <w:rPr/>
-            </w:pPr>
-            <w:r>
-              <w:rPr>
-                <w:sz w:val="17"/>
+              <w:rPr>
+                <w:sz w:val="14"/>
+                <w:szCs w:val="14"/>
+              </w:rPr>
+            </w:pPr>
+            <w:r>
+              <w:rPr>
+                <w:sz w:val="14"/>
+                <w:szCs w:val="14"/>
               </w:rPr>
               <w:t>Efficient ML, model compression, Edge AI and TinyML</w:t>
             </w:r>
@@ -3010,7 +3637,7 @@
         </w:tc>
         <w:tc>
           <w:tcPr>
-            <w:tcW w:w="2014" w:type="dxa"/>
+            <w:tcW w:w="1665" w:type="dxa"/>
             <w:tcBorders>
               <w:top w:val="single" w:sz="4" w:space="0" w:color="111111"/>
               <w:start w:val="single" w:sz="4" w:space="0" w:color="111111"/>
@@ -3028,11 +3655,15 @@
             <w:pPr>
               <w:pStyle w:val="normal1"/>
               <w:spacing w:before="0" w:after="0"/>
-              <w:rPr/>
-            </w:pPr>
-            <w:r>
-              <w:rPr>
-                <w:sz w:val="17"/>
+              <w:rPr>
+                <w:sz w:val="14"/>
+                <w:szCs w:val="14"/>
+              </w:rPr>
+            </w:pPr>
+            <w:r>
+              <w:rPr>
+                <w:sz w:val="14"/>
+                <w:szCs w:val="14"/>
               </w:rPr>
               <w:t>Model quantization/compression and preparation of a small CV model for edge deployment</w:t>
             </w:r>
@@ -3040,7 +3671,7 @@
         </w:tc>
         <w:tc>
           <w:tcPr>
-            <w:tcW w:w="2484" w:type="dxa"/>
+            <w:tcW w:w="3045" w:type="dxa"/>
             <w:tcBorders/>
           </w:tcPr>
           <w:p>
@@ -3048,12 +3679,14 @@
               <w:pStyle w:val="normal1"/>
               <w:spacing w:before="0" w:after="0"/>
               <w:rPr>
-                <w:sz w:val="17"/>
-              </w:rPr>
-            </w:pPr>
-            <w:r>
-              <w:rPr>
-                <w:sz w:val="17"/>
+                <w:sz w:val="14"/>
+                <w:szCs w:val="14"/>
+              </w:rPr>
+            </w:pPr>
+            <w:r>
+              <w:rPr>
+                <w:sz w:val="14"/>
+                <w:szCs w:val="14"/>
               </w:rPr>
               <w:t xml:space="preserve">Small image classification </w:t>
             </w:r>
@@ -3063,28 +3696,55 @@
               <w:pStyle w:val="normal1"/>
               <w:spacing w:before="0" w:after="0"/>
               <w:rPr>
-                <w:sz w:val="17"/>
-              </w:rPr>
-            </w:pPr>
-            <w:r>
-              <w:rPr>
-                <w:sz w:val="17"/>
-              </w:rPr>
-            </w:r>
-          </w:p>
-          <w:p>
-            <w:pPr>
-              <w:pStyle w:val="normal1"/>
-              <w:spacing w:before="0" w:after="0"/>
-              <w:rPr>
-                <w:sz w:val="17"/>
-              </w:rPr>
-            </w:pPr>
-            <w:r>
-              <w:rPr>
-                <w:sz w:val="17"/>
+                <w:sz w:val="14"/>
+                <w:szCs w:val="14"/>
+              </w:rPr>
+            </w:pPr>
+            <w:r>
+              <w:rPr>
+                <w:sz w:val="14"/>
+                <w:szCs w:val="14"/>
+              </w:rPr>
+            </w:r>
+          </w:p>
+          <w:p>
+            <w:pPr>
+              <w:pStyle w:val="normal1"/>
+              <w:spacing w:before="0" w:after="0"/>
+              <w:rPr>
+                <w:sz w:val="14"/>
+                <w:szCs w:val="14"/>
+              </w:rPr>
+            </w:pPr>
+            <w:r>
+              <w:rPr>
+                <w:sz w:val="14"/>
+                <w:szCs w:val="14"/>
               </w:rPr>
               <w:t>reduced BBBC/biological image subset reused from Week 8; train/quantize a compact model for deployment.</w:t>
+            </w:r>
+          </w:p>
+        </w:tc>
+        <w:tc>
+          <w:tcPr>
+            <w:tcW w:w="885" w:type="dxa"/>
+            <w:tcBorders/>
+          </w:tcPr>
+          <w:p>
+            <w:pPr>
+              <w:pStyle w:val="normal1"/>
+              <w:spacing w:before="0" w:after="0"/>
+              <w:rPr>
+                <w:sz w:val="14"/>
+                <w:szCs w:val="14"/>
+              </w:rPr>
+            </w:pPr>
+            <w:r>
+              <w:rPr>
+                <w:sz w:val="14"/>
+                <w:szCs w:val="14"/>
+              </w:rPr>
+              <w:t>Report</w:t>
             </w:r>
           </w:p>
         </w:tc>
@@ -3095,7 +3755,7 @@
         </w:trPr>
         <w:tc>
           <w:tcPr>
-            <w:tcW w:w="385" w:type="dxa"/>
+            <w:tcW w:w="495" w:type="dxa"/>
             <w:tcBorders>
               <w:top w:val="single" w:sz="8" w:space="0" w:color="111111"/>
               <w:bottom w:val="single" w:sz="8" w:space="0" w:color="111111"/>
@@ -3106,11 +3766,15 @@
               <w:pStyle w:val="normal1"/>
               <w:spacing w:before="0" w:after="0"/>
               <w:jc w:val="center"/>
-              <w:rPr/>
-            </w:pPr>
-            <w:r>
-              <w:rPr>
-                <w:sz w:val="17"/>
+              <w:rPr>
+                <w:sz w:val="14"/>
+                <w:szCs w:val="14"/>
+              </w:rPr>
+            </w:pPr>
+            <w:r>
+              <w:rPr>
+                <w:sz w:val="14"/>
+                <w:szCs w:val="14"/>
               </w:rPr>
               <w:t>14</w:t>
             </w:r>
@@ -3118,7 +3782,7 @@
         </w:tc>
         <w:tc>
           <w:tcPr>
-            <w:tcW w:w="572" w:type="dxa"/>
+            <w:tcW w:w="525" w:type="dxa"/>
             <w:tcBorders>
               <w:top w:val="single" w:sz="8" w:space="0" w:color="111111"/>
               <w:bottom w:val="single" w:sz="8" w:space="0" w:color="111111"/>
@@ -3129,16 +3793,22 @@
               <w:pStyle w:val="normal1"/>
               <w:spacing w:before="0" w:after="0"/>
               <w:jc w:val="center"/>
-              <w:rPr/>
-            </w:pPr>
-            <w:r>
-              <w:rPr/>
-            </w:r>
-          </w:p>
-        </w:tc>
-        <w:tc>
-          <w:tcPr>
-            <w:tcW w:w="639" w:type="dxa"/>
+              <w:rPr>
+                <w:sz w:val="14"/>
+                <w:szCs w:val="14"/>
+              </w:rPr>
+            </w:pPr>
+            <w:r>
+              <w:rPr>
+                <w:sz w:val="14"/>
+                <w:szCs w:val="14"/>
+              </w:rPr>
+            </w:r>
+          </w:p>
+        </w:tc>
+        <w:tc>
+          <w:tcPr>
+            <w:tcW w:w="510" w:type="dxa"/>
             <w:tcBorders>
               <w:top w:val="single" w:sz="8" w:space="0" w:color="111111"/>
               <w:bottom w:val="single" w:sz="8" w:space="0" w:color="111111"/>
@@ -3149,11 +3819,15 @@
               <w:pStyle w:val="normal1"/>
               <w:spacing w:before="0" w:after="0"/>
               <w:jc w:val="center"/>
-              <w:rPr/>
-            </w:pPr>
-            <w:r>
-              <w:rPr>
-                <w:sz w:val="17"/>
+              <w:rPr>
+                <w:sz w:val="14"/>
+                <w:szCs w:val="14"/>
+              </w:rPr>
+            </w:pPr>
+            <w:r>
+              <w:rPr>
+                <w:sz w:val="14"/>
+                <w:szCs w:val="14"/>
               </w:rPr>
               <w:t>1</w:t>
             </w:r>
@@ -3161,7 +3835,7 @@
         </w:tc>
         <w:tc>
           <w:tcPr>
-            <w:tcW w:w="3236" w:type="dxa"/>
+            <w:tcW w:w="2475" w:type="dxa"/>
             <w:tcBorders>
               <w:top w:val="single" w:sz="8" w:space="0" w:color="111111"/>
               <w:bottom w:val="single" w:sz="8" w:space="0" w:color="111111"/>
@@ -3171,11 +3845,15 @@
             <w:pPr>
               <w:pStyle w:val="normal1"/>
               <w:spacing w:before="0" w:after="0"/>
-              <w:rPr/>
-            </w:pPr>
-            <w:r>
-              <w:rPr>
-                <w:sz w:val="17"/>
+              <w:rPr>
+                <w:sz w:val="14"/>
+                <w:szCs w:val="14"/>
+              </w:rPr>
+            </w:pPr>
+            <w:r>
+              <w:rPr>
+                <w:sz w:val="14"/>
+                <w:szCs w:val="14"/>
               </w:rPr>
               <w:t>—</w:t>
             </w:r>
@@ -3183,7 +3861,7 @@
         </w:tc>
         <w:tc>
           <w:tcPr>
-            <w:tcW w:w="2014" w:type="dxa"/>
+            <w:tcW w:w="1665" w:type="dxa"/>
             <w:tcBorders>
               <w:top w:val="single" w:sz="4" w:space="0" w:color="111111"/>
               <w:start w:val="single" w:sz="4" w:space="0" w:color="111111"/>
@@ -3201,11 +3879,15 @@
             <w:pPr>
               <w:pStyle w:val="normal1"/>
               <w:spacing w:before="0" w:after="0"/>
-              <w:rPr/>
-            </w:pPr>
-            <w:r>
-              <w:rPr>
-                <w:sz w:val="17"/>
+              <w:rPr>
+                <w:sz w:val="14"/>
+                <w:szCs w:val="14"/>
+              </w:rPr>
+            </w:pPr>
+            <w:r>
+              <w:rPr>
+                <w:sz w:val="14"/>
+                <w:szCs w:val="14"/>
               </w:rPr>
               <w:t>Edge AI practical: ESP32-S3 + camera inference, latency/model-size evaluation; project development</w:t>
             </w:r>
@@ -3213,20 +3895,47 @@
         </w:tc>
         <w:tc>
           <w:tcPr>
-            <w:tcW w:w="2484" w:type="dxa"/>
+            <w:tcW w:w="3045" w:type="dxa"/>
             <w:tcBorders/>
           </w:tcPr>
           <w:p>
             <w:pPr>
               <w:pStyle w:val="normal1"/>
               <w:spacing w:before="0" w:after="0"/>
-              <w:rPr/>
-            </w:pPr>
-            <w:r>
-              <w:rPr>
-                <w:sz w:val="17"/>
+              <w:rPr>
+                <w:sz w:val="14"/>
+                <w:szCs w:val="14"/>
+              </w:rPr>
+            </w:pPr>
+            <w:r>
+              <w:rPr>
+                <w:sz w:val="14"/>
+                <w:szCs w:val="14"/>
               </w:rPr>
               <w:t>Edge-device image stream  ESP32-S3 + camera using the Week 13 image classes or printed biological image targets; measure latency and model size.</w:t>
+            </w:r>
+          </w:p>
+        </w:tc>
+        <w:tc>
+          <w:tcPr>
+            <w:tcW w:w="885" w:type="dxa"/>
+            <w:tcBorders/>
+          </w:tcPr>
+          <w:p>
+            <w:pPr>
+              <w:pStyle w:val="normal1"/>
+              <w:spacing w:before="0" w:after="0"/>
+              <w:rPr>
+                <w:sz w:val="14"/>
+                <w:szCs w:val="14"/>
+              </w:rPr>
+            </w:pPr>
+            <w:r>
+              <w:rPr>
+                <w:sz w:val="14"/>
+                <w:szCs w:val="14"/>
+              </w:rPr>
+              <w:t>Defense</w:t>
             </w:r>
           </w:p>
         </w:tc>
@@ -3237,7 +3946,7 @@
         </w:trPr>
         <w:tc>
           <w:tcPr>
-            <w:tcW w:w="385" w:type="dxa"/>
+            <w:tcW w:w="495" w:type="dxa"/>
             <w:tcBorders>
               <w:top w:val="single" w:sz="8" w:space="0" w:color="111111"/>
               <w:bottom w:val="single" w:sz="8" w:space="0" w:color="111111"/>
@@ -3248,11 +3957,15 @@
               <w:pStyle w:val="normal1"/>
               <w:spacing w:before="0" w:after="0"/>
               <w:jc w:val="center"/>
-              <w:rPr/>
-            </w:pPr>
-            <w:r>
-              <w:rPr>
-                <w:sz w:val="17"/>
+              <w:rPr>
+                <w:sz w:val="14"/>
+                <w:szCs w:val="14"/>
+              </w:rPr>
+            </w:pPr>
+            <w:r>
+              <w:rPr>
+                <w:sz w:val="14"/>
+                <w:szCs w:val="14"/>
               </w:rPr>
               <w:t>15</w:t>
             </w:r>
@@ -3260,7 +3973,7 @@
         </w:tc>
         <w:tc>
           <w:tcPr>
-            <w:tcW w:w="572" w:type="dxa"/>
+            <w:tcW w:w="525" w:type="dxa"/>
             <w:tcBorders>
               <w:top w:val="single" w:sz="8" w:space="0" w:color="111111"/>
               <w:bottom w:val="single" w:sz="8" w:space="0" w:color="111111"/>
@@ -3271,16 +3984,22 @@
               <w:pStyle w:val="normal1"/>
               <w:spacing w:before="0" w:after="0"/>
               <w:jc w:val="center"/>
-              <w:rPr/>
-            </w:pPr>
-            <w:r>
-              <w:rPr/>
-            </w:r>
-          </w:p>
-        </w:tc>
-        <w:tc>
-          <w:tcPr>
-            <w:tcW w:w="639" w:type="dxa"/>
+              <w:rPr>
+                <w:sz w:val="14"/>
+                <w:szCs w:val="14"/>
+              </w:rPr>
+            </w:pPr>
+            <w:r>
+              <w:rPr>
+                <w:sz w:val="14"/>
+                <w:szCs w:val="14"/>
+              </w:rPr>
+            </w:r>
+          </w:p>
+        </w:tc>
+        <w:tc>
+          <w:tcPr>
+            <w:tcW w:w="510" w:type="dxa"/>
             <w:tcBorders>
               <w:top w:val="single" w:sz="8" w:space="0" w:color="111111"/>
               <w:bottom w:val="single" w:sz="8" w:space="0" w:color="111111"/>
@@ -3291,11 +4010,15 @@
               <w:pStyle w:val="normal1"/>
               <w:spacing w:before="0" w:after="0"/>
               <w:jc w:val="center"/>
-              <w:rPr/>
-            </w:pPr>
-            <w:r>
-              <w:rPr>
-                <w:sz w:val="17"/>
+              <w:rPr>
+                <w:sz w:val="14"/>
+                <w:szCs w:val="14"/>
+              </w:rPr>
+            </w:pPr>
+            <w:r>
+              <w:rPr>
+                <w:sz w:val="14"/>
+                <w:szCs w:val="14"/>
               </w:rPr>
               <w:t>1</w:t>
             </w:r>
@@ -3303,7 +4026,7 @@
         </w:tc>
         <w:tc>
           <w:tcPr>
-            <w:tcW w:w="3236" w:type="dxa"/>
+            <w:tcW w:w="2475" w:type="dxa"/>
             <w:tcBorders>
               <w:top w:val="single" w:sz="8" w:space="0" w:color="111111"/>
               <w:bottom w:val="single" w:sz="8" w:space="0" w:color="111111"/>
@@ -3313,11 +4036,15 @@
             <w:pPr>
               <w:pStyle w:val="normal1"/>
               <w:spacing w:before="0" w:after="0"/>
-              <w:rPr/>
-            </w:pPr>
-            <w:r>
-              <w:rPr>
-                <w:sz w:val="17"/>
+              <w:rPr>
+                <w:sz w:val="14"/>
+                <w:szCs w:val="14"/>
+              </w:rPr>
+            </w:pPr>
+            <w:r>
+              <w:rPr>
+                <w:sz w:val="14"/>
+                <w:szCs w:val="14"/>
               </w:rPr>
               <w:t>—</w:t>
             </w:r>
@@ -3325,7 +4052,7 @@
         </w:tc>
         <w:tc>
           <w:tcPr>
-            <w:tcW w:w="2014" w:type="dxa"/>
+            <w:tcW w:w="1665" w:type="dxa"/>
             <w:tcBorders>
               <w:top w:val="single" w:sz="4" w:space="0" w:color="111111"/>
               <w:start w:val="single" w:sz="4" w:space="0" w:color="111111"/>
@@ -3343,11 +4070,15 @@
             <w:pPr>
               <w:pStyle w:val="normal1"/>
               <w:spacing w:before="0" w:after="0"/>
-              <w:rPr/>
-            </w:pPr>
-            <w:r>
-              <w:rPr>
-                <w:sz w:val="17"/>
+              <w:rPr>
+                <w:sz w:val="14"/>
+                <w:szCs w:val="14"/>
+              </w:rPr>
+            </w:pPr>
+            <w:r>
+              <w:rPr>
+                <w:sz w:val="14"/>
+                <w:szCs w:val="14"/>
               </w:rPr>
               <w:t>Independent project development, validation, troubleshooting and consultation</w:t>
             </w:r>
@@ -3355,20 +4086,46 @@
         </w:tc>
         <w:tc>
           <w:tcPr>
-            <w:tcW w:w="2484" w:type="dxa"/>
+            <w:tcW w:w="3045" w:type="dxa"/>
             <w:tcBorders/>
           </w:tcPr>
           <w:p>
             <w:pPr>
               <w:pStyle w:val="normal1"/>
               <w:spacing w:before="0" w:after="0"/>
-              <w:rPr/>
-            </w:pPr>
-            <w:r>
-              <w:rPr>
-                <w:sz w:val="17"/>
+              <w:rPr>
+                <w:sz w:val="14"/>
+                <w:szCs w:val="14"/>
+              </w:rPr>
+            </w:pPr>
+            <w:r>
+              <w:rPr>
+                <w:sz w:val="14"/>
+                <w:szCs w:val="14"/>
               </w:rPr>
               <w:t>Student-selected biological dataset  project-specific modality and dataset.</w:t>
+            </w:r>
+          </w:p>
+        </w:tc>
+        <w:tc>
+          <w:tcPr>
+            <w:tcW w:w="885" w:type="dxa"/>
+            <w:tcBorders/>
+          </w:tcPr>
+          <w:p>
+            <w:pPr>
+              <w:pStyle w:val="normal1"/>
+              <w:spacing w:before="0" w:after="0"/>
+              <w:rPr>
+                <w:sz w:val="14"/>
+                <w:szCs w:val="14"/>
+              </w:rPr>
+            </w:pPr>
+            <w:r>
+              <w:rPr>
+                <w:sz w:val="14"/>
+                <w:szCs w:val="14"/>
+              </w:rPr>
             </w:r>
           </w:p>
         </w:tc>
@@ -3379,7 +4136,7 @@
         </w:trPr>
         <w:tc>
           <w:tcPr>
-            <w:tcW w:w="385" w:type="dxa"/>
+            <w:tcW w:w="495" w:type="dxa"/>
             <w:tcBorders>
               <w:top w:val="single" w:sz="8" w:space="0" w:color="111111"/>
               <w:bottom w:val="single" w:sz="8" w:space="0" w:color="111111"/>
@@ -3390,11 +4147,15 @@
               <w:pStyle w:val="normal1"/>
               <w:spacing w:before="0" w:after="0"/>
               <w:jc w:val="center"/>
-              <w:rPr/>
-            </w:pPr>
-            <w:r>
-              <w:rPr>
-                <w:sz w:val="17"/>
+              <w:rPr>
+                <w:sz w:val="14"/>
+                <w:szCs w:val="14"/>
+              </w:rPr>
+            </w:pPr>
+            <w:r>
+              <w:rPr>
+                <w:sz w:val="14"/>
+                <w:szCs w:val="14"/>
               </w:rPr>
               <w:t>16</w:t>
             </w:r>
@@ -3402,7 +4163,7 @@
         </w:tc>
         <w:tc>
           <w:tcPr>
-            <w:tcW w:w="572" w:type="dxa"/>
+            <w:tcW w:w="525" w:type="dxa"/>
             <w:tcBorders>
               <w:top w:val="single" w:sz="8" w:space="0" w:color="111111"/>
               <w:bottom w:val="single" w:sz="8" w:space="0" w:color="111111"/>
@@ -3413,16 +4174,22 @@
               <w:pStyle w:val="normal1"/>
               <w:spacing w:before="0" w:after="0"/>
               <w:jc w:val="center"/>
-              <w:rPr/>
-            </w:pPr>
-            <w:r>
-              <w:rPr/>
-            </w:r>
-          </w:p>
-        </w:tc>
-        <w:tc>
-          <w:tcPr>
-            <w:tcW w:w="639" w:type="dxa"/>
+              <w:rPr>
+                <w:sz w:val="14"/>
+                <w:szCs w:val="14"/>
+              </w:rPr>
+            </w:pPr>
+            <w:r>
+              <w:rPr>
+                <w:sz w:val="14"/>
+                <w:szCs w:val="14"/>
+              </w:rPr>
+            </w:r>
+          </w:p>
+        </w:tc>
+        <w:tc>
+          <w:tcPr>
+            <w:tcW w:w="510" w:type="dxa"/>
             <w:tcBorders>
               <w:top w:val="single" w:sz="8" w:space="0" w:color="111111"/>
               <w:bottom w:val="single" w:sz="8" w:space="0" w:color="111111"/>
@@ -3433,11 +4200,15 @@
               <w:pStyle w:val="normal1"/>
               <w:spacing w:before="0" w:after="0"/>
               <w:jc w:val="center"/>
-              <w:rPr/>
-            </w:pPr>
-            <w:r>
-              <w:rPr>
-                <w:sz w:val="17"/>
+              <w:rPr>
+                <w:sz w:val="14"/>
+                <w:szCs w:val="14"/>
+              </w:rPr>
+            </w:pPr>
+            <w:r>
+              <w:rPr>
+                <w:sz w:val="14"/>
+                <w:szCs w:val="14"/>
               </w:rPr>
               <w:t>1</w:t>
             </w:r>
@@ -3445,7 +4216,7 @@
         </w:tc>
         <w:tc>
           <w:tcPr>
-            <w:tcW w:w="3236" w:type="dxa"/>
+            <w:tcW w:w="2475" w:type="dxa"/>
             <w:tcBorders>
               <w:top w:val="single" w:sz="8" w:space="0" w:color="111111"/>
               <w:bottom w:val="single" w:sz="8" w:space="0" w:color="111111"/>
@@ -3455,11 +4226,15 @@
             <w:pPr>
               <w:pStyle w:val="normal1"/>
               <w:spacing w:before="0" w:after="0"/>
-              <w:rPr/>
-            </w:pPr>
-            <w:r>
-              <w:rPr>
-                <w:sz w:val="17"/>
+              <w:rPr>
+                <w:sz w:val="14"/>
+                <w:szCs w:val="14"/>
+              </w:rPr>
+            </w:pPr>
+            <w:r>
+              <w:rPr>
+                <w:sz w:val="14"/>
+                <w:szCs w:val="14"/>
               </w:rPr>
               <w:t>—</w:t>
             </w:r>
@@ -3467,7 +4242,7 @@
         </w:tc>
         <w:tc>
           <w:tcPr>
-            <w:tcW w:w="2014" w:type="dxa"/>
+            <w:tcW w:w="1665" w:type="dxa"/>
             <w:tcBorders>
               <w:top w:val="single" w:sz="4" w:space="0" w:color="111111"/>
               <w:start w:val="single" w:sz="4" w:space="0" w:color="111111"/>
@@ -3485,11 +4260,15 @@
             <w:pPr>
               <w:pStyle w:val="normal1"/>
               <w:spacing w:before="0" w:after="0"/>
-              <w:rPr/>
-            </w:pPr>
-            <w:r>
-              <w:rPr>
-                <w:sz w:val="17"/>
+              <w:rPr>
+                <w:sz w:val="14"/>
+                <w:szCs w:val="14"/>
+              </w:rPr>
+            </w:pPr>
+            <w:r>
+              <w:rPr>
+                <w:sz w:val="14"/>
+                <w:szCs w:val="14"/>
               </w:rPr>
               <w:t>Final project presentations and methodological discussion</w:t>
             </w:r>
@@ -3497,20 +4276,46 @@
         </w:tc>
         <w:tc>
           <w:tcPr>
-            <w:tcW w:w="2484" w:type="dxa"/>
+            <w:tcW w:w="3045" w:type="dxa"/>
             <w:tcBorders/>
           </w:tcPr>
           <w:p>
             <w:pPr>
               <w:pStyle w:val="normal1"/>
               <w:spacing w:before="0" w:after="0"/>
-              <w:rPr/>
-            </w:pPr>
-            <w:r>
-              <w:rPr>
-                <w:sz w:val="17"/>
+              <w:rPr>
+                <w:sz w:val="14"/>
+                <w:szCs w:val="14"/>
+              </w:rPr>
+            </w:pPr>
+            <w:r>
+              <w:rPr>
+                <w:sz w:val="14"/>
+                <w:szCs w:val="14"/>
               </w:rPr>
               <w:t>Student-selected biological dataset  final project results and validation.</w:t>
+            </w:r>
+          </w:p>
+        </w:tc>
+        <w:tc>
+          <w:tcPr>
+            <w:tcW w:w="885" w:type="dxa"/>
+            <w:tcBorders/>
+          </w:tcPr>
+          <w:p>
+            <w:pPr>
+              <w:pStyle w:val="normal1"/>
+              <w:spacing w:before="0" w:after="0"/>
+              <w:rPr>
+                <w:sz w:val="14"/>
+                <w:szCs w:val="14"/>
+              </w:rPr>
+            </w:pPr>
+            <w:r>
+              <w:rPr>
+                <w:sz w:val="14"/>
+                <w:szCs w:val="14"/>
+              </w:rPr>
             </w:r>
           </w:p>
         </w:tc>
@@ -3985,11 +4790,7 @@
             </w:pPr>
             <w:r>
               <w:rPr/>
-              <w:t>50</w:t>
-            </w:r>
-            <w:r>
-              <w:rPr/>
-              <w:t>%</w:t>
+              <w:t>50%</w:t>
             </w:r>
           </w:p>
         </w:tc>
@@ -4056,11 +4857,7 @@
             </w:pPr>
             <w:r>
               <w:rPr/>
-              <w:t>Participation in class</w:t>
-            </w:r>
-            <w:r>
-              <w:rPr/>
-              <w:t>(bonuses)</w:t>
+              <w:t>Participation in class(bonuses)</w:t>
             </w:r>
           </w:p>
         </w:tc>
@@ -4136,7 +4933,11 @@
       </w:pPr>
       <w:r>
         <w:rPr/>
-        <w:t xml:space="preserve">Practical assignment will be assessed either in form of assignment defense presentation, or written report. </w:t>
+        <w:t>Practical assignment will be assessed either in form of assignment defense presentation, or written repor</w:t>
+      </w:r>
+      <w:r>
+        <w:rPr/>
+        <w:t>t.</w:t>
       </w:r>
     </w:p>
     <w:p>
@@ -4547,33 +5348,7 @@
           <w:spacing w:val="0"/>
           <w:sz w:val="26"/>
         </w:rPr>
-        <w:t xml:space="preserve">Deep Learning in Bioinformatics </w:t>
-      </w:r>
-      <w:r>
-        <w:rPr>
-          <w:rFonts w:ascii="system-ui;apple-system;Segoe UI;sans-serif" w:hAnsi="system-ui;apple-system;Segoe UI;sans-serif"/>
-          <w:b w:val="false"/>
-          <w:i w:val="false"/>
-          <w:caps w:val="false"/>
-          <w:smallCaps w:val="false"/>
-          <w:color w:val="243142"/>
-          <w:spacing w:val="0"/>
-          <w:sz w:val="26"/>
-        </w:rPr>
-        <w:t>T</w:t>
-      </w:r>
-      <w:r>
-        <w:rPr>
-          <w:rFonts w:ascii="system-ui;apple-system;Segoe UI;sans-serif" w:hAnsi="system-ui;apple-system;Segoe UI;sans-serif"/>
-          <w:b w:val="false"/>
-          <w:i w:val="false"/>
-          <w:caps w:val="false"/>
-          <w:smallCaps w:val="false"/>
-          <w:color w:val="243142"/>
-          <w:spacing w:val="0"/>
-          <w:sz w:val="26"/>
-        </w:rPr>
-        <w:t>echniques and Applications in Practice</w:t>
+        <w:t>Deep Learning in Bioinformatics Techniques and Applications in Practice</w:t>
       </w:r>
     </w:p>
     <w:p>
@@ -5738,8 +6513,8 @@
       <w:bCs/>
     </w:rPr>
   </w:style>
-  <w:style w:type="character" w:styleId="Style8">
-    <w:name w:val="Маркери"/>
+  <w:style w:type="character" w:styleId="user">
+    <w:name w:val="Маркери (user)"/>
     <w:qFormat/>
     <w:rPr>
       <w:rFonts w:ascii="OpenSymbol" w:hAnsi="OpenSymbol" w:eastAsia="OpenSymbol" w:cs="OpenSymbol"/>
@@ -5752,12 +6527,12 @@
       <w:u w:val="single"/>
     </w:rPr>
   </w:style>
-  <w:style w:type="character" w:styleId="Style9">
-    <w:name w:val="Символ нумерації"/>
+  <w:style w:type="character" w:styleId="user1">
+    <w:name w:val="Символ нумерації (user)"/>
     <w:qFormat/>
     <w:rPr/>
   </w:style>
-  <w:style w:type="paragraph" w:styleId="Style10">
+  <w:style w:type="paragraph" w:styleId="Style8">
     <w:name w:val="Заголовок"/>
     <w:basedOn w:val="Normal"/>
     <w:next w:val="BodyText"/>
@@ -5804,7 +6579,7 @@
       <w:szCs w:val="24"/>
     </w:rPr>
   </w:style>
-  <w:style w:type="paragraph" w:styleId="Style11">
+  <w:style w:type="paragraph" w:styleId="Style9">
     <w:name w:val="Покажчик"/>
     <w:basedOn w:val="Normal"/>
     <w:qFormat/>
@@ -5815,7 +6590,7 @@
       <w:rFonts w:cs="Arial"/>
     </w:rPr>
   </w:style>
-  <w:style w:type="paragraph" w:styleId="user">
+  <w:style w:type="paragraph" w:styleId="user2">
     <w:name w:val="Заголовок (user)"/>
     <w:basedOn w:val="Normal"/>
     <w:next w:val="BodyText"/>
@@ -5830,7 +6605,7 @@
       <w:szCs w:val="28"/>
     </w:rPr>
   </w:style>
-  <w:style w:type="paragraph" w:styleId="user1">
+  <w:style w:type="paragraph" w:styleId="user3">
     <w:name w:val="Покажчик (user)"/>
     <w:basedOn w:val="Normal"/>
     <w:qFormat/>
@@ -5896,8 +6671,8 @@
       <w:szCs w:val="30"/>
     </w:rPr>
   </w:style>
-  <w:style w:type="paragraph" w:styleId="user2">
-    <w:name w:val="Вміст таблиці (user)"/>
+  <w:style w:type="paragraph" w:styleId="Style10">
+    <w:name w:val="Вміст таблиці"/>
     <w:basedOn w:val="Normal"/>
     <w:qFormat/>
     <w:pPr>
@@ -5906,9 +6681,9 @@
     </w:pPr>
     <w:rPr/>
   </w:style>
-  <w:style w:type="paragraph" w:styleId="user3">
-    <w:name w:val="Заголовок таблиці (user)"/>
-    <w:basedOn w:val="user2"/>
+  <w:style w:type="paragraph" w:styleId="Style11">
+    <w:name w:val="Заголовок таблиці"/>
+    <w:basedOn w:val="Style10"/>
     <w:qFormat/>
     <w:pPr>
       <w:suppressLineNumbers/>

</xml_diff>